<commit_message>
Requisitos funcionais e não funcionais
</commit_message>
<xml_diff>
--- a/Relatorio_Mu_Torere.docx
+++ b/Relatorio_Mu_Torere.docx
@@ -68,7 +68,7 @@
       </w:pPr>
       <w:r>
         <w:drawing>
-          <wp:inline xmlns:wp14="http://schemas.microsoft.com/office/word/2010/wordprocessingDrawing" wp14:editId="5AA1153A" wp14:anchorId="051803B2">
+          <wp:inline xmlns:wp14="http://schemas.microsoft.com/office/word/2010/wordprocessingDrawing" wp14:editId="08CC1419" wp14:anchorId="051803B2">
             <wp:extent cx="5486400" cy="4629150"/>
             <wp:effectExtent l="0" t="0" r="0" b="0"/>
             <wp:docPr id="1580095076" name="drawing"/>
@@ -2492,16 +2492,6 @@
     </w:p>
     <w:p>
       <w:pPr>
-        <w:pStyle w:val="Normal"/>
-        <w:ind w:left="0"/>
-        <w:rPr>
-          <w:noProof w:val="0"/>
-          <w:lang w:val="pt-BR"/>
-        </w:rPr>
-      </w:pPr>
-    </w:p>
-    <w:p>
-      <w:pPr>
         <w:spacing w:before="240" w:beforeAutospacing="off" w:after="198" w:afterAutospacing="off" w:line="276" w:lineRule="auto"/>
         <w:jc w:val="left"/>
         <w:rPr>
@@ -2515,7 +2505,3310 @@
     </w:p>
     <w:p>
       <w:pPr>
+        <w:pStyle w:val="Heading1"/>
+      </w:pPr>
+      <w:r>
         <w:rPr>
+          <w:noProof w:val="0"/>
+          <w:lang w:val="pt-BR"/>
+        </w:rPr>
+        <w:t>6. Requisitos Funcionais (RF)</w:t>
+      </w:r>
+    </w:p>
+    <w:tbl>
+      <w:tblPr>
+        <w:tblStyle w:val="MediumGrid2-Accent6"/>
+        <w:bidiVisual w:val="0"/>
+        <w:tblW w:w="0" w:type="auto"/>
+        <w:tblLook w:val="06A0" w:firstRow="1" w:lastRow="0" w:firstColumn="1" w:lastColumn="0" w:noHBand="1" w:noVBand="1"/>
+      </w:tblPr>
+      <w:tblGrid>
+        <w:gridCol w:w="1020"/>
+        <w:gridCol w:w="2850"/>
+        <w:gridCol w:w="6155"/>
+      </w:tblGrid>
+      <w:tr>
+        <w:trPr>
+          <w:trHeight w:val="390"/>
+        </w:trPr>
+        <w:tc>
+          <w:tcPr>
+            <w:cnfStyle w:val="001000000100" w:firstRow="0" w:lastRow="0" w:firstColumn="1" w:lastColumn="0" w:oddVBand="0" w:evenVBand="0" w:oddHBand="0" w:evenHBand="0" w:firstRowFirstColumn="1" w:firstRowLastColumn="0" w:lastRowFirstColumn="0" w:lastRowLastColumn="0"/>
+            <w:tcW w:w="1020" w:type="dxa"/>
+            <w:tcBorders>
+              <w:top w:val="single" w:color="F79646" w:themeColor="accent6" w:sz="4"/>
+              <w:left w:val="single" w:color="F79646" w:themeColor="accent6" w:sz="4"/>
+              <w:bottom w:val="single" w:color="F79646" w:themeColor="accent6" w:sz="4"/>
+              <w:right w:val="single" w:color="F79646" w:themeColor="accent6" w:sz="4"/>
+            </w:tcBorders>
+            <w:tcMar/>
+          </w:tcPr>
+          <w:p>
+            <w:pPr>
+              <w:bidi w:val="0"/>
+              <w:spacing w:before="0" w:beforeAutospacing="off" w:after="0" w:afterAutospacing="off"/>
+              <w:jc w:val="center"/>
+            </w:pPr>
+            <w:r>
+              <w:rPr>
+                <w:b w:val="1"/>
+                <w:bCs w:val="1"/>
+              </w:rPr>
+              <w:t>ID</w:t>
+            </w:r>
+          </w:p>
+        </w:tc>
+        <w:tc>
+          <w:tcPr>
+            <w:cnfStyle w:val="000000000000" w:firstRow="0" w:lastRow="0" w:firstColumn="0" w:lastColumn="0" w:oddVBand="0" w:evenVBand="0" w:oddHBand="0" w:evenHBand="0" w:firstRowFirstColumn="0" w:firstRowLastColumn="0" w:lastRowFirstColumn="0" w:lastRowLastColumn="0"/>
+            <w:tcW w:w="2850" w:type="dxa"/>
+            <w:tcBorders>
+              <w:top w:val="single" w:color="F79646" w:themeColor="accent6" w:sz="4"/>
+              <w:left w:val="single" w:color="F79646" w:themeColor="accent6" w:sz="4"/>
+              <w:bottom w:val="single" w:color="F79646" w:themeColor="accent6" w:sz="4"/>
+              <w:right w:val="single" w:color="F79646" w:themeColor="accent6" w:sz="4"/>
+            </w:tcBorders>
+            <w:tcMar/>
+          </w:tcPr>
+          <w:p>
+            <w:pPr>
+              <w:bidi w:val="0"/>
+              <w:spacing w:before="0" w:beforeAutospacing="off" w:after="0" w:afterAutospacing="off"/>
+              <w:jc w:val="center"/>
+            </w:pPr>
+            <w:r>
+              <w:rPr>
+                <w:b w:val="1"/>
+                <w:bCs w:val="1"/>
+              </w:rPr>
+              <w:t>Requisito</w:t>
+            </w:r>
+          </w:p>
+        </w:tc>
+        <w:tc>
+          <w:tcPr>
+            <w:cnfStyle w:val="000000000000" w:firstRow="0" w:lastRow="0" w:firstColumn="0" w:lastColumn="0" w:oddVBand="0" w:evenVBand="0" w:oddHBand="0" w:evenHBand="0" w:firstRowFirstColumn="0" w:firstRowLastColumn="0" w:lastRowFirstColumn="0" w:lastRowLastColumn="0"/>
+            <w:tcW w:w="6155" w:type="dxa"/>
+            <w:tcBorders>
+              <w:top w:val="single" w:color="F79646" w:themeColor="accent6" w:sz="4"/>
+              <w:left w:val="single" w:color="F79646" w:themeColor="accent6" w:sz="4"/>
+              <w:bottom w:val="single" w:color="F79646" w:themeColor="accent6" w:sz="4"/>
+              <w:right w:val="single" w:color="F79646" w:themeColor="accent6" w:sz="4"/>
+            </w:tcBorders>
+            <w:tcMar/>
+          </w:tcPr>
+          <w:p>
+            <w:pPr>
+              <w:bidi w:val="0"/>
+              <w:spacing w:before="0" w:beforeAutospacing="off" w:after="0" w:afterAutospacing="off"/>
+              <w:jc w:val="center"/>
+            </w:pPr>
+            <w:r>
+              <w:rPr>
+                <w:b w:val="1"/>
+                <w:bCs w:val="1"/>
+              </w:rPr>
+              <w:t>Descrição</w:t>
+            </w:r>
+          </w:p>
+        </w:tc>
+      </w:tr>
+      <w:tr>
+        <w:trPr>
+          <w:trHeight w:val="300"/>
+        </w:trPr>
+        <w:tc>
+          <w:tcPr>
+            <w:cnfStyle w:val="001000000000" w:firstRow="0" w:lastRow="0" w:firstColumn="1" w:lastColumn="0" w:oddVBand="0" w:evenVBand="0" w:oddHBand="0" w:evenHBand="0" w:firstRowFirstColumn="0" w:firstRowLastColumn="0" w:lastRowFirstColumn="0" w:lastRowLastColumn="0"/>
+            <w:tcW w:w="1020" w:type="dxa"/>
+            <w:tcBorders>
+              <w:top w:val="single" w:color="F79646" w:themeColor="accent6" w:sz="4"/>
+              <w:left w:val="single" w:color="F79646" w:themeColor="accent6" w:sz="4"/>
+              <w:bottom w:val="single" w:color="F79646" w:themeColor="accent6" w:sz="4"/>
+              <w:right w:val="single" w:color="F79646" w:themeColor="accent6" w:sz="4"/>
+            </w:tcBorders>
+            <w:tcMar/>
+            <w:vAlign w:val="center"/>
+          </w:tcPr>
+          <w:p>
+            <w:pPr>
+              <w:bidi w:val="0"/>
+              <w:spacing w:before="0" w:beforeAutospacing="off" w:after="0" w:afterAutospacing="off"/>
+              <w:jc w:val="center"/>
+            </w:pPr>
+            <w:r>
+              <w:rPr/>
+              <w:t>RF01</w:t>
+            </w:r>
+          </w:p>
+        </w:tc>
+        <w:tc>
+          <w:tcPr>
+            <w:cnfStyle w:val="000000000000" w:firstRow="0" w:lastRow="0" w:firstColumn="0" w:lastColumn="0" w:oddVBand="0" w:evenVBand="0" w:oddHBand="0" w:evenHBand="0" w:firstRowFirstColumn="0" w:firstRowLastColumn="0" w:lastRowFirstColumn="0" w:lastRowLastColumn="0"/>
+            <w:tcW w:w="2850" w:type="dxa"/>
+            <w:tcBorders>
+              <w:top w:val="single" w:color="F79646" w:themeColor="accent6" w:sz="4"/>
+              <w:left w:val="single" w:color="F79646" w:themeColor="accent6" w:sz="4"/>
+              <w:bottom w:val="single" w:color="F79646" w:themeColor="accent6" w:sz="4"/>
+              <w:right w:val="single" w:color="F79646" w:themeColor="accent6" w:sz="4"/>
+            </w:tcBorders>
+            <w:tcMar/>
+            <w:vAlign w:val="center"/>
+          </w:tcPr>
+          <w:p>
+            <w:pPr>
+              <w:bidi w:val="0"/>
+              <w:spacing w:before="0" w:beforeAutospacing="off" w:after="0" w:afterAutospacing="off"/>
+              <w:jc w:val="center"/>
+            </w:pPr>
+            <w:r>
+              <w:rPr/>
+              <w:t>Iniciar</w:t>
+            </w:r>
+            <w:r>
+              <w:rPr/>
+              <w:t xml:space="preserve"> </w:t>
+            </w:r>
+            <w:r>
+              <w:rPr/>
+              <w:t>jogo</w:t>
+            </w:r>
+          </w:p>
+        </w:tc>
+        <w:tc>
+          <w:tcPr>
+            <w:cnfStyle w:val="000000000000" w:firstRow="0" w:lastRow="0" w:firstColumn="0" w:lastColumn="0" w:oddVBand="0" w:evenVBand="0" w:oddHBand="0" w:evenHBand="0" w:firstRowFirstColumn="0" w:firstRowLastColumn="0" w:lastRowFirstColumn="0" w:lastRowLastColumn="0"/>
+            <w:tcW w:w="6155" w:type="dxa"/>
+            <w:tcBorders>
+              <w:top w:val="single" w:color="F79646" w:themeColor="accent6" w:sz="4"/>
+              <w:left w:val="single" w:color="F79646" w:themeColor="accent6" w:sz="4"/>
+              <w:bottom w:val="single" w:color="F79646" w:themeColor="accent6" w:sz="4"/>
+              <w:right w:val="single" w:color="F79646" w:themeColor="accent6" w:sz="4"/>
+            </w:tcBorders>
+            <w:tcMar/>
+            <w:vAlign w:val="center"/>
+          </w:tcPr>
+          <w:p>
+            <w:pPr>
+              <w:bidi w:val="0"/>
+              <w:spacing w:before="0" w:beforeAutospacing="off" w:after="0" w:afterAutospacing="off"/>
+              <w:jc w:val="center"/>
+            </w:pPr>
+            <w:r>
+              <w:rPr/>
+              <w:t xml:space="preserve">O </w:t>
+            </w:r>
+            <w:r>
+              <w:rPr/>
+              <w:t>sistema</w:t>
+            </w:r>
+            <w:r>
+              <w:rPr/>
+              <w:t xml:space="preserve"> </w:t>
+            </w:r>
+            <w:r>
+              <w:rPr/>
+              <w:t>deve</w:t>
+            </w:r>
+            <w:r>
+              <w:rPr/>
+              <w:t xml:space="preserve"> </w:t>
+            </w:r>
+            <w:r>
+              <w:rPr/>
+              <w:t>permitir</w:t>
+            </w:r>
+            <w:r>
+              <w:rPr/>
+              <w:t xml:space="preserve"> </w:t>
+            </w:r>
+            <w:r>
+              <w:rPr/>
+              <w:t>iniciar</w:t>
+            </w:r>
+            <w:r>
+              <w:rPr/>
+              <w:t xml:space="preserve"> </w:t>
+            </w:r>
+            <w:r>
+              <w:rPr/>
+              <w:t>uma</w:t>
+            </w:r>
+            <w:r>
+              <w:rPr/>
+              <w:t xml:space="preserve"> nova </w:t>
+            </w:r>
+            <w:r>
+              <w:rPr/>
+              <w:t>partida</w:t>
+            </w:r>
+            <w:r>
+              <w:rPr/>
+              <w:t xml:space="preserve"> com as </w:t>
+            </w:r>
+            <w:r>
+              <w:rPr/>
+              <w:t>peças</w:t>
+            </w:r>
+            <w:r>
+              <w:rPr/>
+              <w:t xml:space="preserve"> </w:t>
+            </w:r>
+            <w:r>
+              <w:rPr/>
+              <w:t>nas</w:t>
+            </w:r>
+            <w:r>
+              <w:rPr/>
+              <w:t xml:space="preserve"> </w:t>
+            </w:r>
+            <w:r>
+              <w:rPr/>
+              <w:t>posições</w:t>
+            </w:r>
+            <w:r>
+              <w:rPr/>
+              <w:t xml:space="preserve"> </w:t>
+            </w:r>
+            <w:r>
+              <w:rPr/>
+              <w:t>iniciais</w:t>
+            </w:r>
+            <w:r>
+              <w:rPr/>
+              <w:t>.</w:t>
+            </w:r>
+          </w:p>
+        </w:tc>
+      </w:tr>
+      <w:tr>
+        <w:trPr>
+          <w:trHeight w:val="300"/>
+        </w:trPr>
+        <w:tc>
+          <w:tcPr>
+            <w:cnfStyle w:val="001000000000" w:firstRow="0" w:lastRow="0" w:firstColumn="1" w:lastColumn="0" w:oddVBand="0" w:evenVBand="0" w:oddHBand="0" w:evenHBand="0" w:firstRowFirstColumn="0" w:firstRowLastColumn="0" w:lastRowFirstColumn="0" w:lastRowLastColumn="0"/>
+            <w:tcW w:w="1020" w:type="dxa"/>
+            <w:tcBorders>
+              <w:top w:val="single" w:color="F79646" w:themeColor="accent6" w:sz="4"/>
+              <w:left w:val="single" w:color="F79646" w:themeColor="accent6" w:sz="4"/>
+              <w:bottom w:val="single" w:color="F79646" w:themeColor="accent6" w:sz="4"/>
+              <w:right w:val="single" w:color="F79646" w:themeColor="accent6" w:sz="4"/>
+            </w:tcBorders>
+            <w:tcMar/>
+            <w:vAlign w:val="center"/>
+          </w:tcPr>
+          <w:p>
+            <w:pPr>
+              <w:bidi w:val="0"/>
+              <w:spacing w:before="0" w:beforeAutospacing="off" w:after="0" w:afterAutospacing="off"/>
+              <w:jc w:val="center"/>
+            </w:pPr>
+            <w:r>
+              <w:rPr/>
+              <w:t>RF02</w:t>
+            </w:r>
+          </w:p>
+        </w:tc>
+        <w:tc>
+          <w:tcPr>
+            <w:cnfStyle w:val="000000000000" w:firstRow="0" w:lastRow="0" w:firstColumn="0" w:lastColumn="0" w:oddVBand="0" w:evenVBand="0" w:oddHBand="0" w:evenHBand="0" w:firstRowFirstColumn="0" w:firstRowLastColumn="0" w:lastRowFirstColumn="0" w:lastRowLastColumn="0"/>
+            <w:tcW w:w="2850" w:type="dxa"/>
+            <w:tcBorders>
+              <w:top w:val="single" w:color="F79646" w:themeColor="accent6" w:sz="4"/>
+              <w:left w:val="single" w:color="F79646" w:themeColor="accent6" w:sz="4"/>
+              <w:bottom w:val="single" w:color="F79646" w:themeColor="accent6" w:sz="4"/>
+              <w:right w:val="single" w:color="F79646" w:themeColor="accent6" w:sz="4"/>
+            </w:tcBorders>
+            <w:tcMar/>
+            <w:vAlign w:val="center"/>
+          </w:tcPr>
+          <w:p>
+            <w:pPr>
+              <w:bidi w:val="0"/>
+              <w:spacing w:before="0" w:beforeAutospacing="off" w:after="0" w:afterAutospacing="off"/>
+              <w:jc w:val="center"/>
+            </w:pPr>
+            <w:r>
+              <w:rPr/>
+              <w:t>Representar</w:t>
+            </w:r>
+            <w:r>
+              <w:rPr/>
+              <w:t xml:space="preserve"> </w:t>
+            </w:r>
+            <w:r>
+              <w:rPr/>
+              <w:t>tabuleiro</w:t>
+            </w:r>
+          </w:p>
+        </w:tc>
+        <w:tc>
+          <w:tcPr>
+            <w:cnfStyle w:val="000000000000" w:firstRow="0" w:lastRow="0" w:firstColumn="0" w:lastColumn="0" w:oddVBand="0" w:evenVBand="0" w:oddHBand="0" w:evenHBand="0" w:firstRowFirstColumn="0" w:firstRowLastColumn="0" w:lastRowFirstColumn="0" w:lastRowLastColumn="0"/>
+            <w:tcW w:w="6155" w:type="dxa"/>
+            <w:tcBorders>
+              <w:top w:val="single" w:color="F79646" w:themeColor="accent6" w:sz="4"/>
+              <w:left w:val="single" w:color="F79646" w:themeColor="accent6" w:sz="4"/>
+              <w:bottom w:val="single" w:color="F79646" w:themeColor="accent6" w:sz="4"/>
+              <w:right w:val="single" w:color="F79646" w:themeColor="accent6" w:sz="4"/>
+            </w:tcBorders>
+            <w:tcMar/>
+            <w:vAlign w:val="center"/>
+          </w:tcPr>
+          <w:p>
+            <w:pPr>
+              <w:bidi w:val="0"/>
+              <w:spacing w:before="0" w:beforeAutospacing="off" w:after="0" w:afterAutospacing="off"/>
+              <w:jc w:val="center"/>
+            </w:pPr>
+            <w:r>
+              <w:rPr/>
+              <w:t xml:space="preserve">O </w:t>
+            </w:r>
+            <w:r>
+              <w:rPr/>
+              <w:t>sistema</w:t>
+            </w:r>
+            <w:r>
+              <w:rPr/>
+              <w:t xml:space="preserve"> </w:t>
+            </w:r>
+            <w:r>
+              <w:rPr/>
+              <w:t>deve</w:t>
+            </w:r>
+            <w:r>
+              <w:rPr/>
+              <w:t xml:space="preserve"> </w:t>
+            </w:r>
+            <w:r>
+              <w:rPr/>
+              <w:t>representar</w:t>
+            </w:r>
+            <w:r>
+              <w:rPr/>
+              <w:t xml:space="preserve"> </w:t>
+            </w:r>
+            <w:r>
+              <w:rPr/>
+              <w:t>corretamente</w:t>
+            </w:r>
+            <w:r>
+              <w:rPr/>
+              <w:t xml:space="preserve"> o </w:t>
+            </w:r>
+            <w:r>
+              <w:rPr/>
+              <w:t>tabuleiro</w:t>
+            </w:r>
+            <w:r>
+              <w:rPr/>
+              <w:t xml:space="preserve"> com 9 </w:t>
+            </w:r>
+            <w:r>
+              <w:rPr/>
+              <w:t>posições</w:t>
+            </w:r>
+            <w:r>
+              <w:rPr/>
+              <w:t>.</w:t>
+            </w:r>
+          </w:p>
+        </w:tc>
+      </w:tr>
+      <w:tr>
+        <w:trPr>
+          <w:trHeight w:val="300"/>
+        </w:trPr>
+        <w:tc>
+          <w:tcPr>
+            <w:cnfStyle w:val="001000000000" w:firstRow="0" w:lastRow="0" w:firstColumn="1" w:lastColumn="0" w:oddVBand="0" w:evenVBand="0" w:oddHBand="0" w:evenHBand="0" w:firstRowFirstColumn="0" w:firstRowLastColumn="0" w:lastRowFirstColumn="0" w:lastRowLastColumn="0"/>
+            <w:tcW w:w="1020" w:type="dxa"/>
+            <w:tcBorders>
+              <w:top w:val="single" w:color="F79646" w:themeColor="accent6" w:sz="4"/>
+              <w:left w:val="single" w:color="F79646" w:themeColor="accent6" w:sz="4"/>
+              <w:bottom w:val="single" w:color="F79646" w:themeColor="accent6" w:sz="4"/>
+              <w:right w:val="single" w:color="F79646" w:themeColor="accent6" w:sz="4"/>
+            </w:tcBorders>
+            <w:tcMar/>
+            <w:vAlign w:val="center"/>
+          </w:tcPr>
+          <w:p>
+            <w:pPr>
+              <w:bidi w:val="0"/>
+              <w:spacing w:before="0" w:beforeAutospacing="off" w:after="0" w:afterAutospacing="off"/>
+              <w:jc w:val="center"/>
+            </w:pPr>
+            <w:r>
+              <w:rPr/>
+              <w:t>RF03</w:t>
+            </w:r>
+          </w:p>
+        </w:tc>
+        <w:tc>
+          <w:tcPr>
+            <w:cnfStyle w:val="000000000000" w:firstRow="0" w:lastRow="0" w:firstColumn="0" w:lastColumn="0" w:oddVBand="0" w:evenVBand="0" w:oddHBand="0" w:evenHBand="0" w:firstRowFirstColumn="0" w:firstRowLastColumn="0" w:lastRowFirstColumn="0" w:lastRowLastColumn="0"/>
+            <w:tcW w:w="2850" w:type="dxa"/>
+            <w:tcBorders>
+              <w:top w:val="single" w:color="F79646" w:themeColor="accent6" w:sz="4"/>
+              <w:left w:val="single" w:color="F79646" w:themeColor="accent6" w:sz="4"/>
+              <w:bottom w:val="single" w:color="F79646" w:themeColor="accent6" w:sz="4"/>
+              <w:right w:val="single" w:color="F79646" w:themeColor="accent6" w:sz="4"/>
+            </w:tcBorders>
+            <w:tcMar/>
+            <w:vAlign w:val="center"/>
+          </w:tcPr>
+          <w:p>
+            <w:pPr>
+              <w:bidi w:val="0"/>
+              <w:spacing w:before="0" w:beforeAutospacing="off" w:after="0" w:afterAutospacing="off"/>
+              <w:jc w:val="center"/>
+            </w:pPr>
+            <w:r>
+              <w:rPr/>
+              <w:t xml:space="preserve">Mover </w:t>
+            </w:r>
+            <w:r>
+              <w:rPr/>
+              <w:t>peça</w:t>
+            </w:r>
+          </w:p>
+        </w:tc>
+        <w:tc>
+          <w:tcPr>
+            <w:cnfStyle w:val="000000000000" w:firstRow="0" w:lastRow="0" w:firstColumn="0" w:lastColumn="0" w:oddVBand="0" w:evenVBand="0" w:oddHBand="0" w:evenHBand="0" w:firstRowFirstColumn="0" w:firstRowLastColumn="0" w:lastRowFirstColumn="0" w:lastRowLastColumn="0"/>
+            <w:tcW w:w="6155" w:type="dxa"/>
+            <w:tcBorders>
+              <w:top w:val="single" w:color="F79646" w:themeColor="accent6" w:sz="4"/>
+              <w:left w:val="single" w:color="F79646" w:themeColor="accent6" w:sz="4"/>
+              <w:bottom w:val="single" w:color="F79646" w:themeColor="accent6" w:sz="4"/>
+              <w:right w:val="single" w:color="F79646" w:themeColor="accent6" w:sz="4"/>
+            </w:tcBorders>
+            <w:tcMar/>
+            <w:vAlign w:val="center"/>
+          </w:tcPr>
+          <w:p>
+            <w:pPr>
+              <w:bidi w:val="0"/>
+              <w:spacing w:before="0" w:beforeAutospacing="off" w:after="0" w:afterAutospacing="off"/>
+              <w:jc w:val="center"/>
+            </w:pPr>
+            <w:r>
+              <w:rPr/>
+              <w:t xml:space="preserve">O </w:t>
+            </w:r>
+            <w:r>
+              <w:rPr/>
+              <w:t>sistema</w:t>
+            </w:r>
+            <w:r>
+              <w:rPr/>
+              <w:t xml:space="preserve"> </w:t>
+            </w:r>
+            <w:r>
+              <w:rPr/>
+              <w:t>deve</w:t>
+            </w:r>
+            <w:r>
+              <w:rPr/>
+              <w:t xml:space="preserve"> </w:t>
+            </w:r>
+            <w:r>
+              <w:rPr/>
+              <w:t>permitir</w:t>
+            </w:r>
+            <w:r>
+              <w:rPr/>
+              <w:t xml:space="preserve"> </w:t>
+            </w:r>
+            <w:r>
+              <w:rPr/>
+              <w:t>ao</w:t>
+            </w:r>
+            <w:r>
+              <w:rPr/>
+              <w:t xml:space="preserve"> </w:t>
+            </w:r>
+            <w:r>
+              <w:rPr/>
+              <w:t>jogador</w:t>
+            </w:r>
+            <w:r>
+              <w:rPr/>
+              <w:t xml:space="preserve"> </w:t>
+            </w:r>
+            <w:r>
+              <w:rPr/>
+              <w:t>ativo</w:t>
+            </w:r>
+            <w:r>
+              <w:rPr/>
+              <w:t xml:space="preserve"> mover </w:t>
+            </w:r>
+            <w:r>
+              <w:rPr/>
+              <w:t>uma</w:t>
+            </w:r>
+            <w:r>
+              <w:rPr/>
+              <w:t xml:space="preserve"> </w:t>
+            </w:r>
+            <w:r>
+              <w:rPr/>
+              <w:t>peça</w:t>
+            </w:r>
+            <w:r>
+              <w:rPr/>
+              <w:t xml:space="preserve"> </w:t>
+            </w:r>
+            <w:r>
+              <w:rPr/>
+              <w:t>válida</w:t>
+            </w:r>
+            <w:r>
+              <w:rPr/>
+              <w:t xml:space="preserve"> </w:t>
+            </w:r>
+            <w:r>
+              <w:rPr/>
+              <w:t>por</w:t>
+            </w:r>
+            <w:r>
+              <w:rPr/>
+              <w:t xml:space="preserve"> </w:t>
+            </w:r>
+            <w:r>
+              <w:rPr/>
+              <w:t>turno</w:t>
+            </w:r>
+            <w:r>
+              <w:rPr/>
+              <w:t>.</w:t>
+            </w:r>
+          </w:p>
+        </w:tc>
+      </w:tr>
+      <w:tr>
+        <w:trPr>
+          <w:trHeight w:val="300"/>
+        </w:trPr>
+        <w:tc>
+          <w:tcPr>
+            <w:cnfStyle w:val="001000000000" w:firstRow="0" w:lastRow="0" w:firstColumn="1" w:lastColumn="0" w:oddVBand="0" w:evenVBand="0" w:oddHBand="0" w:evenHBand="0" w:firstRowFirstColumn="0" w:firstRowLastColumn="0" w:lastRowFirstColumn="0" w:lastRowLastColumn="0"/>
+            <w:tcW w:w="1020" w:type="dxa"/>
+            <w:tcBorders>
+              <w:top w:val="single" w:color="F79646" w:themeColor="accent6" w:sz="4"/>
+              <w:left w:val="single" w:color="F79646" w:themeColor="accent6" w:sz="4"/>
+              <w:bottom w:val="single" w:color="F79646" w:themeColor="accent6" w:sz="4"/>
+              <w:right w:val="single" w:color="F79646" w:themeColor="accent6" w:sz="4"/>
+            </w:tcBorders>
+            <w:tcMar/>
+            <w:vAlign w:val="center"/>
+          </w:tcPr>
+          <w:p>
+            <w:pPr>
+              <w:bidi w:val="0"/>
+              <w:spacing w:before="0" w:beforeAutospacing="off" w:after="0" w:afterAutospacing="off"/>
+              <w:jc w:val="center"/>
+            </w:pPr>
+            <w:r>
+              <w:rPr/>
+              <w:t>RF04</w:t>
+            </w:r>
+          </w:p>
+        </w:tc>
+        <w:tc>
+          <w:tcPr>
+            <w:cnfStyle w:val="000000000000" w:firstRow="0" w:lastRow="0" w:firstColumn="0" w:lastColumn="0" w:oddVBand="0" w:evenVBand="0" w:oddHBand="0" w:evenHBand="0" w:firstRowFirstColumn="0" w:firstRowLastColumn="0" w:lastRowFirstColumn="0" w:lastRowLastColumn="0"/>
+            <w:tcW w:w="2850" w:type="dxa"/>
+            <w:tcBorders>
+              <w:top w:val="single" w:color="F79646" w:themeColor="accent6" w:sz="4"/>
+              <w:left w:val="single" w:color="F79646" w:themeColor="accent6" w:sz="4"/>
+              <w:bottom w:val="single" w:color="F79646" w:themeColor="accent6" w:sz="4"/>
+              <w:right w:val="single" w:color="F79646" w:themeColor="accent6" w:sz="4"/>
+            </w:tcBorders>
+            <w:tcMar/>
+            <w:vAlign w:val="center"/>
+          </w:tcPr>
+          <w:p>
+            <w:pPr>
+              <w:bidi w:val="0"/>
+              <w:spacing w:before="0" w:beforeAutospacing="off" w:after="0" w:afterAutospacing="off"/>
+              <w:jc w:val="center"/>
+            </w:pPr>
+            <w:r>
+              <w:rPr/>
+              <w:t xml:space="preserve">Validar </w:t>
+            </w:r>
+            <w:r>
+              <w:rPr/>
+              <w:t>movimento</w:t>
+            </w:r>
+          </w:p>
+        </w:tc>
+        <w:tc>
+          <w:tcPr>
+            <w:cnfStyle w:val="000000000000" w:firstRow="0" w:lastRow="0" w:firstColumn="0" w:lastColumn="0" w:oddVBand="0" w:evenVBand="0" w:oddHBand="0" w:evenHBand="0" w:firstRowFirstColumn="0" w:firstRowLastColumn="0" w:lastRowFirstColumn="0" w:lastRowLastColumn="0"/>
+            <w:tcW w:w="6155" w:type="dxa"/>
+            <w:tcBorders>
+              <w:top w:val="single" w:color="F79646" w:themeColor="accent6" w:sz="4"/>
+              <w:left w:val="single" w:color="F79646" w:themeColor="accent6" w:sz="4"/>
+              <w:bottom w:val="single" w:color="F79646" w:themeColor="accent6" w:sz="4"/>
+              <w:right w:val="single" w:color="F79646" w:themeColor="accent6" w:sz="4"/>
+            </w:tcBorders>
+            <w:tcMar/>
+            <w:vAlign w:val="center"/>
+          </w:tcPr>
+          <w:p>
+            <w:pPr>
+              <w:bidi w:val="0"/>
+              <w:spacing w:before="0" w:beforeAutospacing="off" w:after="0" w:afterAutospacing="off"/>
+              <w:jc w:val="center"/>
+            </w:pPr>
+            <w:r>
+              <w:rPr/>
+              <w:t xml:space="preserve">O </w:t>
+            </w:r>
+            <w:r>
+              <w:rPr/>
+              <w:t>sistema</w:t>
+            </w:r>
+            <w:r>
+              <w:rPr/>
+              <w:t xml:space="preserve"> </w:t>
+            </w:r>
+            <w:r>
+              <w:rPr/>
+              <w:t>deve</w:t>
+            </w:r>
+            <w:r>
+              <w:rPr/>
+              <w:t xml:space="preserve"> </w:t>
+            </w:r>
+            <w:r>
+              <w:rPr/>
+              <w:t>verificar</w:t>
+            </w:r>
+            <w:r>
+              <w:rPr/>
+              <w:t xml:space="preserve"> se um </w:t>
+            </w:r>
+            <w:r>
+              <w:rPr/>
+              <w:t>movimento</w:t>
+            </w:r>
+            <w:r>
+              <w:rPr/>
+              <w:t xml:space="preserve"> é </w:t>
+            </w:r>
+            <w:r>
+              <w:rPr/>
+              <w:t>válido</w:t>
+            </w:r>
+            <w:r>
+              <w:rPr/>
+              <w:t xml:space="preserve"> antes da </w:t>
+            </w:r>
+            <w:r>
+              <w:rPr/>
+              <w:t>sua</w:t>
+            </w:r>
+            <w:r>
+              <w:rPr/>
+              <w:t xml:space="preserve"> </w:t>
+            </w:r>
+            <w:r>
+              <w:rPr/>
+              <w:t>execução</w:t>
+            </w:r>
+            <w:r>
+              <w:rPr/>
+              <w:t>.</w:t>
+            </w:r>
+          </w:p>
+        </w:tc>
+      </w:tr>
+      <w:tr>
+        <w:trPr>
+          <w:trHeight w:val="300"/>
+        </w:trPr>
+        <w:tc>
+          <w:tcPr>
+            <w:cnfStyle w:val="001000000000" w:firstRow="0" w:lastRow="0" w:firstColumn="1" w:lastColumn="0" w:oddVBand="0" w:evenVBand="0" w:oddHBand="0" w:evenHBand="0" w:firstRowFirstColumn="0" w:firstRowLastColumn="0" w:lastRowFirstColumn="0" w:lastRowLastColumn="0"/>
+            <w:tcW w:w="1020" w:type="dxa"/>
+            <w:tcBorders>
+              <w:top w:val="single" w:color="F79646" w:themeColor="accent6" w:sz="4"/>
+              <w:left w:val="single" w:color="F79646" w:themeColor="accent6" w:sz="4"/>
+              <w:bottom w:val="single" w:color="F79646" w:themeColor="accent6" w:sz="4"/>
+              <w:right w:val="single" w:color="F79646" w:themeColor="accent6" w:sz="4"/>
+            </w:tcBorders>
+            <w:tcMar/>
+            <w:vAlign w:val="center"/>
+          </w:tcPr>
+          <w:p>
+            <w:pPr>
+              <w:bidi w:val="0"/>
+              <w:spacing w:before="0" w:beforeAutospacing="off" w:after="0" w:afterAutospacing="off"/>
+              <w:jc w:val="center"/>
+            </w:pPr>
+            <w:r>
+              <w:rPr/>
+              <w:t>RF05</w:t>
+            </w:r>
+          </w:p>
+        </w:tc>
+        <w:tc>
+          <w:tcPr>
+            <w:cnfStyle w:val="000000000000" w:firstRow="0" w:lastRow="0" w:firstColumn="0" w:lastColumn="0" w:oddVBand="0" w:evenVBand="0" w:oddHBand="0" w:evenHBand="0" w:firstRowFirstColumn="0" w:firstRowLastColumn="0" w:lastRowFirstColumn="0" w:lastRowLastColumn="0"/>
+            <w:tcW w:w="2850" w:type="dxa"/>
+            <w:tcBorders>
+              <w:top w:val="single" w:color="F79646" w:themeColor="accent6" w:sz="4"/>
+              <w:left w:val="single" w:color="F79646" w:themeColor="accent6" w:sz="4"/>
+              <w:bottom w:val="single" w:color="F79646" w:themeColor="accent6" w:sz="4"/>
+              <w:right w:val="single" w:color="F79646" w:themeColor="accent6" w:sz="4"/>
+            </w:tcBorders>
+            <w:tcMar/>
+            <w:vAlign w:val="center"/>
+          </w:tcPr>
+          <w:p>
+            <w:pPr>
+              <w:bidi w:val="0"/>
+              <w:spacing w:before="0" w:beforeAutospacing="off" w:after="0" w:afterAutospacing="off"/>
+              <w:jc w:val="center"/>
+            </w:pPr>
+            <w:r>
+              <w:rPr/>
+              <w:t>Impedir</w:t>
+            </w:r>
+            <w:r>
+              <w:rPr/>
+              <w:t xml:space="preserve"> </w:t>
+            </w:r>
+            <w:r>
+              <w:rPr/>
+              <w:t>movimentos</w:t>
+            </w:r>
+            <w:r>
+              <w:rPr/>
+              <w:t xml:space="preserve"> </w:t>
+            </w:r>
+            <w:r>
+              <w:rPr/>
+              <w:t>inválidos</w:t>
+            </w:r>
+          </w:p>
+        </w:tc>
+        <w:tc>
+          <w:tcPr>
+            <w:cnfStyle w:val="000000000000" w:firstRow="0" w:lastRow="0" w:firstColumn="0" w:lastColumn="0" w:oddVBand="0" w:evenVBand="0" w:oddHBand="0" w:evenHBand="0" w:firstRowFirstColumn="0" w:firstRowLastColumn="0" w:lastRowFirstColumn="0" w:lastRowLastColumn="0"/>
+            <w:tcW w:w="6155" w:type="dxa"/>
+            <w:tcBorders>
+              <w:top w:val="single" w:color="F79646" w:themeColor="accent6" w:sz="4"/>
+              <w:left w:val="single" w:color="F79646" w:themeColor="accent6" w:sz="4"/>
+              <w:bottom w:val="single" w:color="F79646" w:themeColor="accent6" w:sz="4"/>
+              <w:right w:val="single" w:color="F79646" w:themeColor="accent6" w:sz="4"/>
+            </w:tcBorders>
+            <w:tcMar/>
+            <w:vAlign w:val="center"/>
+          </w:tcPr>
+          <w:p>
+            <w:pPr>
+              <w:bidi w:val="0"/>
+              <w:spacing w:before="0" w:beforeAutospacing="off" w:after="0" w:afterAutospacing="off"/>
+              <w:jc w:val="center"/>
+            </w:pPr>
+            <w:r>
+              <w:rPr/>
+              <w:t xml:space="preserve">O </w:t>
+            </w:r>
+            <w:r>
+              <w:rPr/>
+              <w:t>sistema</w:t>
+            </w:r>
+            <w:r>
+              <w:rPr/>
+              <w:t xml:space="preserve"> </w:t>
+            </w:r>
+            <w:r>
+              <w:rPr/>
+              <w:t>deve</w:t>
+            </w:r>
+            <w:r>
+              <w:rPr/>
+              <w:t xml:space="preserve"> </w:t>
+            </w:r>
+            <w:r>
+              <w:rPr/>
+              <w:t>impedir</w:t>
+            </w:r>
+            <w:r>
+              <w:rPr/>
+              <w:t xml:space="preserve"> </w:t>
+            </w:r>
+            <w:r>
+              <w:rPr/>
+              <w:t>a</w:t>
+            </w:r>
+            <w:r>
+              <w:rPr/>
+              <w:t xml:space="preserve"> </w:t>
+            </w:r>
+            <w:r>
+              <w:rPr/>
+              <w:t>execução</w:t>
+            </w:r>
+            <w:r>
+              <w:rPr/>
+              <w:t xml:space="preserve"> de </w:t>
+            </w:r>
+            <w:r>
+              <w:rPr/>
+              <w:t>movimentos</w:t>
+            </w:r>
+            <w:r>
+              <w:rPr/>
+              <w:t xml:space="preserve"> </w:t>
+            </w:r>
+            <w:r>
+              <w:rPr/>
+              <w:t>que</w:t>
+            </w:r>
+            <w:r>
+              <w:rPr/>
+              <w:t xml:space="preserve"> </w:t>
+            </w:r>
+            <w:r>
+              <w:rPr/>
+              <w:t>violem</w:t>
+            </w:r>
+            <w:r>
+              <w:rPr/>
+              <w:t xml:space="preserve"> as </w:t>
+            </w:r>
+            <w:r>
+              <w:rPr/>
+              <w:t>regras</w:t>
+            </w:r>
+            <w:r>
+              <w:rPr/>
+              <w:t xml:space="preserve"> do </w:t>
+            </w:r>
+            <w:r>
+              <w:rPr/>
+              <w:t>jogo</w:t>
+            </w:r>
+            <w:r>
+              <w:rPr/>
+              <w:t>.</w:t>
+            </w:r>
+          </w:p>
+        </w:tc>
+      </w:tr>
+      <w:tr>
+        <w:trPr>
+          <w:trHeight w:val="300"/>
+        </w:trPr>
+        <w:tc>
+          <w:tcPr>
+            <w:cnfStyle w:val="001000000000" w:firstRow="0" w:lastRow="0" w:firstColumn="1" w:lastColumn="0" w:oddVBand="0" w:evenVBand="0" w:oddHBand="0" w:evenHBand="0" w:firstRowFirstColumn="0" w:firstRowLastColumn="0" w:lastRowFirstColumn="0" w:lastRowLastColumn="0"/>
+            <w:tcW w:w="1020" w:type="dxa"/>
+            <w:tcBorders>
+              <w:top w:val="single" w:color="F79646" w:themeColor="accent6" w:sz="4"/>
+              <w:left w:val="single" w:color="F79646" w:themeColor="accent6" w:sz="4"/>
+              <w:bottom w:val="single" w:color="F79646" w:themeColor="accent6" w:sz="4"/>
+              <w:right w:val="single" w:color="F79646" w:themeColor="accent6" w:sz="4"/>
+            </w:tcBorders>
+            <w:tcMar/>
+            <w:vAlign w:val="center"/>
+          </w:tcPr>
+          <w:p>
+            <w:pPr>
+              <w:bidi w:val="0"/>
+              <w:spacing w:before="0" w:beforeAutospacing="off" w:after="0" w:afterAutospacing="off"/>
+              <w:jc w:val="center"/>
+            </w:pPr>
+            <w:r>
+              <w:rPr/>
+              <w:t>RF06</w:t>
+            </w:r>
+          </w:p>
+        </w:tc>
+        <w:tc>
+          <w:tcPr>
+            <w:cnfStyle w:val="000000000000" w:firstRow="0" w:lastRow="0" w:firstColumn="0" w:lastColumn="0" w:oddVBand="0" w:evenVBand="0" w:oddHBand="0" w:evenHBand="0" w:firstRowFirstColumn="0" w:firstRowLastColumn="0" w:lastRowFirstColumn="0" w:lastRowLastColumn="0"/>
+            <w:tcW w:w="2850" w:type="dxa"/>
+            <w:tcBorders>
+              <w:top w:val="single" w:color="F79646" w:themeColor="accent6" w:sz="4"/>
+              <w:left w:val="single" w:color="F79646" w:themeColor="accent6" w:sz="4"/>
+              <w:bottom w:val="single" w:color="F79646" w:themeColor="accent6" w:sz="4"/>
+              <w:right w:val="single" w:color="F79646" w:themeColor="accent6" w:sz="4"/>
+            </w:tcBorders>
+            <w:tcMar/>
+            <w:vAlign w:val="center"/>
+          </w:tcPr>
+          <w:p>
+            <w:pPr>
+              <w:bidi w:val="0"/>
+              <w:spacing w:before="0" w:beforeAutospacing="off" w:after="0" w:afterAutospacing="off"/>
+              <w:jc w:val="center"/>
+            </w:pPr>
+            <w:r>
+              <w:rPr/>
+              <w:t>Alternar</w:t>
+            </w:r>
+            <w:r>
+              <w:rPr/>
+              <w:t xml:space="preserve"> </w:t>
+            </w:r>
+            <w:r>
+              <w:rPr/>
+              <w:t>turno</w:t>
+            </w:r>
+          </w:p>
+        </w:tc>
+        <w:tc>
+          <w:tcPr>
+            <w:cnfStyle w:val="000000000000" w:firstRow="0" w:lastRow="0" w:firstColumn="0" w:lastColumn="0" w:oddVBand="0" w:evenVBand="0" w:oddHBand="0" w:evenHBand="0" w:firstRowFirstColumn="0" w:firstRowLastColumn="0" w:lastRowFirstColumn="0" w:lastRowLastColumn="0"/>
+            <w:tcW w:w="6155" w:type="dxa"/>
+            <w:tcBorders>
+              <w:top w:val="single" w:color="F79646" w:themeColor="accent6" w:sz="4"/>
+              <w:left w:val="single" w:color="F79646" w:themeColor="accent6" w:sz="4"/>
+              <w:bottom w:val="single" w:color="F79646" w:themeColor="accent6" w:sz="4"/>
+              <w:right w:val="single" w:color="F79646" w:themeColor="accent6" w:sz="4"/>
+            </w:tcBorders>
+            <w:tcMar/>
+            <w:vAlign w:val="center"/>
+          </w:tcPr>
+          <w:p>
+            <w:pPr>
+              <w:bidi w:val="0"/>
+              <w:spacing w:before="0" w:beforeAutospacing="off" w:after="0" w:afterAutospacing="off"/>
+              <w:jc w:val="center"/>
+            </w:pPr>
+            <w:r>
+              <w:rPr/>
+              <w:t xml:space="preserve">O </w:t>
+            </w:r>
+            <w:r>
+              <w:rPr/>
+              <w:t>sistema</w:t>
+            </w:r>
+            <w:r>
+              <w:rPr/>
+              <w:t xml:space="preserve"> </w:t>
+            </w:r>
+            <w:r>
+              <w:rPr/>
+              <w:t>deve</w:t>
+            </w:r>
+            <w:r>
+              <w:rPr/>
+              <w:t xml:space="preserve"> </w:t>
+            </w:r>
+            <w:r>
+              <w:rPr/>
+              <w:t>alternar</w:t>
+            </w:r>
+            <w:r>
+              <w:rPr/>
+              <w:t xml:space="preserve"> </w:t>
+            </w:r>
+            <w:r>
+              <w:rPr/>
+              <w:t>automaticamente</w:t>
+            </w:r>
+            <w:r>
+              <w:rPr/>
+              <w:t xml:space="preserve"> o </w:t>
+            </w:r>
+            <w:r>
+              <w:rPr/>
+              <w:t>turno</w:t>
+            </w:r>
+            <w:r>
+              <w:rPr/>
+              <w:t xml:space="preserve"> entre </w:t>
+            </w:r>
+            <w:r>
+              <w:rPr/>
+              <w:t>jogadores</w:t>
+            </w:r>
+            <w:r>
+              <w:rPr/>
+              <w:t>.</w:t>
+            </w:r>
+          </w:p>
+        </w:tc>
+      </w:tr>
+      <w:tr>
+        <w:trPr>
+          <w:trHeight w:val="300"/>
+        </w:trPr>
+        <w:tc>
+          <w:tcPr>
+            <w:cnfStyle w:val="001000000000" w:firstRow="0" w:lastRow="0" w:firstColumn="1" w:lastColumn="0" w:oddVBand="0" w:evenVBand="0" w:oddHBand="0" w:evenHBand="0" w:firstRowFirstColumn="0" w:firstRowLastColumn="0" w:lastRowFirstColumn="0" w:lastRowLastColumn="0"/>
+            <w:tcW w:w="1020" w:type="dxa"/>
+            <w:tcBorders>
+              <w:top w:val="single" w:color="F79646" w:themeColor="accent6" w:sz="4"/>
+              <w:left w:val="single" w:color="F79646" w:themeColor="accent6" w:sz="4"/>
+              <w:bottom w:val="single" w:color="F79646" w:themeColor="accent6" w:sz="4"/>
+              <w:right w:val="single" w:color="F79646" w:themeColor="accent6" w:sz="4"/>
+            </w:tcBorders>
+            <w:tcMar/>
+            <w:vAlign w:val="center"/>
+          </w:tcPr>
+          <w:p>
+            <w:pPr>
+              <w:bidi w:val="0"/>
+              <w:spacing w:before="0" w:beforeAutospacing="off" w:after="0" w:afterAutospacing="off"/>
+              <w:jc w:val="center"/>
+            </w:pPr>
+            <w:r>
+              <w:rPr/>
+              <w:t>RF07</w:t>
+            </w:r>
+          </w:p>
+        </w:tc>
+        <w:tc>
+          <w:tcPr>
+            <w:cnfStyle w:val="000000000000" w:firstRow="0" w:lastRow="0" w:firstColumn="0" w:lastColumn="0" w:oddVBand="0" w:evenVBand="0" w:oddHBand="0" w:evenHBand="0" w:firstRowFirstColumn="0" w:firstRowLastColumn="0" w:lastRowFirstColumn="0" w:lastRowLastColumn="0"/>
+            <w:tcW w:w="2850" w:type="dxa"/>
+            <w:tcBorders>
+              <w:top w:val="single" w:color="F79646" w:themeColor="accent6" w:sz="4"/>
+              <w:left w:val="single" w:color="F79646" w:themeColor="accent6" w:sz="4"/>
+              <w:bottom w:val="single" w:color="F79646" w:themeColor="accent6" w:sz="4"/>
+              <w:right w:val="single" w:color="F79646" w:themeColor="accent6" w:sz="4"/>
+            </w:tcBorders>
+            <w:tcMar/>
+            <w:vAlign w:val="center"/>
+          </w:tcPr>
+          <w:p>
+            <w:pPr>
+              <w:bidi w:val="0"/>
+              <w:spacing w:before="0" w:beforeAutospacing="off" w:after="0" w:afterAutospacing="off"/>
+              <w:jc w:val="center"/>
+            </w:pPr>
+            <w:r>
+              <w:rPr/>
+              <w:t>Verificar</w:t>
+            </w:r>
+            <w:r>
+              <w:rPr/>
+              <w:t xml:space="preserve"> </w:t>
+            </w:r>
+            <w:r>
+              <w:rPr/>
+              <w:t>condição</w:t>
+            </w:r>
+            <w:r>
+              <w:rPr/>
+              <w:t xml:space="preserve"> de </w:t>
+            </w:r>
+            <w:r>
+              <w:rPr/>
+              <w:t>vitória</w:t>
+            </w:r>
+          </w:p>
+        </w:tc>
+        <w:tc>
+          <w:tcPr>
+            <w:cnfStyle w:val="000000000000" w:firstRow="0" w:lastRow="0" w:firstColumn="0" w:lastColumn="0" w:oddVBand="0" w:evenVBand="0" w:oddHBand="0" w:evenHBand="0" w:firstRowFirstColumn="0" w:firstRowLastColumn="0" w:lastRowFirstColumn="0" w:lastRowLastColumn="0"/>
+            <w:tcW w:w="6155" w:type="dxa"/>
+            <w:tcBorders>
+              <w:top w:val="single" w:color="F79646" w:themeColor="accent6" w:sz="4"/>
+              <w:left w:val="single" w:color="F79646" w:themeColor="accent6" w:sz="4"/>
+              <w:bottom w:val="single" w:color="F79646" w:themeColor="accent6" w:sz="4"/>
+              <w:right w:val="single" w:color="F79646" w:themeColor="accent6" w:sz="4"/>
+            </w:tcBorders>
+            <w:tcMar/>
+            <w:vAlign w:val="center"/>
+          </w:tcPr>
+          <w:p>
+            <w:pPr>
+              <w:bidi w:val="0"/>
+              <w:spacing w:before="0" w:beforeAutospacing="off" w:after="0" w:afterAutospacing="off"/>
+              <w:jc w:val="center"/>
+            </w:pPr>
+            <w:r>
+              <w:rPr/>
+              <w:t xml:space="preserve">O </w:t>
+            </w:r>
+            <w:r>
+              <w:rPr/>
+              <w:t>sistema</w:t>
+            </w:r>
+            <w:r>
+              <w:rPr/>
+              <w:t xml:space="preserve"> </w:t>
+            </w:r>
+            <w:r>
+              <w:rPr/>
+              <w:t>deve</w:t>
+            </w:r>
+            <w:r>
+              <w:rPr/>
+              <w:t xml:space="preserve"> </w:t>
+            </w:r>
+            <w:r>
+              <w:rPr/>
+              <w:t>detetar</w:t>
+            </w:r>
+            <w:r>
+              <w:rPr/>
+              <w:t xml:space="preserve"> </w:t>
+            </w:r>
+            <w:r>
+              <w:rPr/>
+              <w:t>quando</w:t>
+            </w:r>
+            <w:r>
+              <w:rPr/>
+              <w:t xml:space="preserve"> um </w:t>
+            </w:r>
+            <w:r>
+              <w:rPr/>
+              <w:t>jogador</w:t>
+            </w:r>
+            <w:r>
+              <w:rPr/>
+              <w:t xml:space="preserve"> </w:t>
+            </w:r>
+            <w:r>
+              <w:rPr/>
+              <w:t>não</w:t>
+            </w:r>
+            <w:r>
+              <w:rPr/>
+              <w:t xml:space="preserve"> </w:t>
+            </w:r>
+            <w:r>
+              <w:rPr/>
+              <w:t>possui</w:t>
+            </w:r>
+            <w:r>
+              <w:rPr/>
+              <w:t xml:space="preserve"> </w:t>
+            </w:r>
+            <w:r>
+              <w:rPr/>
+              <w:t>movimentos</w:t>
+            </w:r>
+            <w:r>
+              <w:rPr/>
+              <w:t xml:space="preserve"> </w:t>
+            </w:r>
+            <w:r>
+              <w:rPr/>
+              <w:t>válidos</w:t>
+            </w:r>
+            <w:r>
+              <w:rPr/>
+              <w:t>.</w:t>
+            </w:r>
+          </w:p>
+        </w:tc>
+      </w:tr>
+      <w:tr>
+        <w:trPr>
+          <w:trHeight w:val="300"/>
+        </w:trPr>
+        <w:tc>
+          <w:tcPr>
+            <w:cnfStyle w:val="001000000000" w:firstRow="0" w:lastRow="0" w:firstColumn="1" w:lastColumn="0" w:oddVBand="0" w:evenVBand="0" w:oddHBand="0" w:evenHBand="0" w:firstRowFirstColumn="0" w:firstRowLastColumn="0" w:lastRowFirstColumn="0" w:lastRowLastColumn="0"/>
+            <w:tcW w:w="1020" w:type="dxa"/>
+            <w:tcBorders>
+              <w:top w:val="single" w:color="F79646" w:themeColor="accent6" w:sz="4"/>
+              <w:left w:val="single" w:color="F79646" w:themeColor="accent6" w:sz="4"/>
+              <w:bottom w:val="single" w:color="F79646" w:themeColor="accent6" w:sz="4"/>
+              <w:right w:val="single" w:color="F79646" w:themeColor="accent6" w:sz="4"/>
+            </w:tcBorders>
+            <w:tcMar/>
+            <w:vAlign w:val="center"/>
+          </w:tcPr>
+          <w:p>
+            <w:pPr>
+              <w:bidi w:val="0"/>
+              <w:spacing w:before="0" w:beforeAutospacing="off" w:after="0" w:afterAutospacing="off"/>
+              <w:jc w:val="center"/>
+            </w:pPr>
+            <w:r>
+              <w:rPr/>
+              <w:t>RF08</w:t>
+            </w:r>
+          </w:p>
+        </w:tc>
+        <w:tc>
+          <w:tcPr>
+            <w:cnfStyle w:val="000000000000" w:firstRow="0" w:lastRow="0" w:firstColumn="0" w:lastColumn="0" w:oddVBand="0" w:evenVBand="0" w:oddHBand="0" w:evenHBand="0" w:firstRowFirstColumn="0" w:firstRowLastColumn="0" w:lastRowFirstColumn="0" w:lastRowLastColumn="0"/>
+            <w:tcW w:w="2850" w:type="dxa"/>
+            <w:tcBorders>
+              <w:top w:val="single" w:color="F79646" w:themeColor="accent6" w:sz="4"/>
+              <w:left w:val="single" w:color="F79646" w:themeColor="accent6" w:sz="4"/>
+              <w:bottom w:val="single" w:color="F79646" w:themeColor="accent6" w:sz="4"/>
+              <w:right w:val="single" w:color="F79646" w:themeColor="accent6" w:sz="4"/>
+            </w:tcBorders>
+            <w:tcMar/>
+            <w:vAlign w:val="center"/>
+          </w:tcPr>
+          <w:p>
+            <w:pPr>
+              <w:bidi w:val="0"/>
+              <w:spacing w:before="0" w:beforeAutospacing="off" w:after="0" w:afterAutospacing="off"/>
+              <w:jc w:val="center"/>
+            </w:pPr>
+            <w:r>
+              <w:rPr/>
+              <w:t>Declarar</w:t>
+            </w:r>
+            <w:r>
+              <w:rPr/>
+              <w:t xml:space="preserve"> </w:t>
+            </w:r>
+            <w:r>
+              <w:rPr/>
+              <w:t>vencedor</w:t>
+            </w:r>
+          </w:p>
+        </w:tc>
+        <w:tc>
+          <w:tcPr>
+            <w:cnfStyle w:val="000000000000" w:firstRow="0" w:lastRow="0" w:firstColumn="0" w:lastColumn="0" w:oddVBand="0" w:evenVBand="0" w:oddHBand="0" w:evenHBand="0" w:firstRowFirstColumn="0" w:firstRowLastColumn="0" w:lastRowFirstColumn="0" w:lastRowLastColumn="0"/>
+            <w:tcW w:w="6155" w:type="dxa"/>
+            <w:tcBorders>
+              <w:top w:val="single" w:color="F79646" w:themeColor="accent6" w:sz="4"/>
+              <w:left w:val="single" w:color="F79646" w:themeColor="accent6" w:sz="4"/>
+              <w:bottom w:val="single" w:color="F79646" w:themeColor="accent6" w:sz="4"/>
+              <w:right w:val="single" w:color="F79646" w:themeColor="accent6" w:sz="4"/>
+            </w:tcBorders>
+            <w:tcMar/>
+            <w:vAlign w:val="center"/>
+          </w:tcPr>
+          <w:p>
+            <w:pPr>
+              <w:bidi w:val="0"/>
+              <w:spacing w:before="0" w:beforeAutospacing="off" w:after="0" w:afterAutospacing="off"/>
+              <w:jc w:val="center"/>
+            </w:pPr>
+            <w:r>
+              <w:rPr/>
+              <w:t xml:space="preserve">O </w:t>
+            </w:r>
+            <w:r>
+              <w:rPr/>
+              <w:t>sistema</w:t>
+            </w:r>
+            <w:r>
+              <w:rPr/>
+              <w:t xml:space="preserve"> </w:t>
+            </w:r>
+            <w:r>
+              <w:rPr/>
+              <w:t>deve</w:t>
+            </w:r>
+            <w:r>
+              <w:rPr/>
+              <w:t xml:space="preserve"> </w:t>
+            </w:r>
+            <w:r>
+              <w:rPr/>
+              <w:t>declarar</w:t>
+            </w:r>
+            <w:r>
+              <w:rPr/>
+              <w:t xml:space="preserve"> o </w:t>
+            </w:r>
+            <w:r>
+              <w:rPr/>
+              <w:t>vencedor</w:t>
+            </w:r>
+            <w:r>
+              <w:rPr/>
+              <w:t xml:space="preserve"> </w:t>
+            </w:r>
+            <w:r>
+              <w:rPr/>
+              <w:t>quando</w:t>
+            </w:r>
+            <w:r>
+              <w:rPr/>
+              <w:t xml:space="preserve"> o </w:t>
+            </w:r>
+            <w:r>
+              <w:rPr/>
+              <w:t>adversário</w:t>
+            </w:r>
+            <w:r>
+              <w:rPr/>
+              <w:t xml:space="preserve"> </w:t>
+            </w:r>
+            <w:r>
+              <w:rPr/>
+              <w:t>fica</w:t>
+            </w:r>
+            <w:r>
+              <w:rPr/>
+              <w:t xml:space="preserve"> </w:t>
+            </w:r>
+            <w:r>
+              <w:rPr/>
+              <w:t>bloqueado</w:t>
+            </w:r>
+            <w:r>
+              <w:rPr/>
+              <w:t>.</w:t>
+            </w:r>
+          </w:p>
+        </w:tc>
+      </w:tr>
+      <w:tr>
+        <w:trPr>
+          <w:trHeight w:val="300"/>
+        </w:trPr>
+        <w:tc>
+          <w:tcPr>
+            <w:cnfStyle w:val="001000000000" w:firstRow="0" w:lastRow="0" w:firstColumn="1" w:lastColumn="0" w:oddVBand="0" w:evenVBand="0" w:oddHBand="0" w:evenHBand="0" w:firstRowFirstColumn="0" w:firstRowLastColumn="0" w:lastRowFirstColumn="0" w:lastRowLastColumn="0"/>
+            <w:tcW w:w="1020" w:type="dxa"/>
+            <w:tcBorders>
+              <w:top w:val="single" w:color="F79646" w:themeColor="accent6" w:sz="4"/>
+              <w:left w:val="single" w:color="F79646" w:themeColor="accent6" w:sz="4"/>
+              <w:bottom w:val="single" w:color="F79646" w:themeColor="accent6" w:sz="4"/>
+              <w:right w:val="single" w:color="F79646" w:themeColor="accent6" w:sz="4"/>
+            </w:tcBorders>
+            <w:tcMar/>
+            <w:vAlign w:val="center"/>
+          </w:tcPr>
+          <w:p>
+            <w:pPr>
+              <w:bidi w:val="0"/>
+              <w:spacing w:before="0" w:beforeAutospacing="off" w:after="0" w:afterAutospacing="off"/>
+              <w:jc w:val="center"/>
+            </w:pPr>
+            <w:r>
+              <w:rPr/>
+              <w:t>RF09</w:t>
+            </w:r>
+          </w:p>
+        </w:tc>
+        <w:tc>
+          <w:tcPr>
+            <w:cnfStyle w:val="000000000000" w:firstRow="0" w:lastRow="0" w:firstColumn="0" w:lastColumn="0" w:oddVBand="0" w:evenVBand="0" w:oddHBand="0" w:evenHBand="0" w:firstRowFirstColumn="0" w:firstRowLastColumn="0" w:lastRowFirstColumn="0" w:lastRowLastColumn="0"/>
+            <w:tcW w:w="2850" w:type="dxa"/>
+            <w:tcBorders>
+              <w:top w:val="single" w:color="F79646" w:themeColor="accent6" w:sz="4"/>
+              <w:left w:val="single" w:color="F79646" w:themeColor="accent6" w:sz="4"/>
+              <w:bottom w:val="single" w:color="F79646" w:themeColor="accent6" w:sz="4"/>
+              <w:right w:val="single" w:color="F79646" w:themeColor="accent6" w:sz="4"/>
+            </w:tcBorders>
+            <w:tcMar/>
+            <w:vAlign w:val="center"/>
+          </w:tcPr>
+          <w:p>
+            <w:pPr>
+              <w:bidi w:val="0"/>
+              <w:spacing w:before="0" w:beforeAutospacing="off" w:after="0" w:afterAutospacing="off"/>
+              <w:jc w:val="center"/>
+            </w:pPr>
+            <w:r>
+              <w:rPr/>
+              <w:t xml:space="preserve">Interface </w:t>
+            </w:r>
+            <w:r>
+              <w:rPr/>
+              <w:t>gráfica</w:t>
+            </w:r>
+            <w:r>
+              <w:rPr/>
+              <w:t xml:space="preserve"> (GUI)</w:t>
+            </w:r>
+          </w:p>
+        </w:tc>
+        <w:tc>
+          <w:tcPr>
+            <w:cnfStyle w:val="000000000000" w:firstRow="0" w:lastRow="0" w:firstColumn="0" w:lastColumn="0" w:oddVBand="0" w:evenVBand="0" w:oddHBand="0" w:evenHBand="0" w:firstRowFirstColumn="0" w:firstRowLastColumn="0" w:lastRowFirstColumn="0" w:lastRowLastColumn="0"/>
+            <w:tcW w:w="6155" w:type="dxa"/>
+            <w:tcBorders>
+              <w:top w:val="single" w:color="F79646" w:themeColor="accent6" w:sz="4"/>
+              <w:left w:val="single" w:color="F79646" w:themeColor="accent6" w:sz="4"/>
+              <w:bottom w:val="single" w:color="F79646" w:themeColor="accent6" w:sz="4"/>
+              <w:right w:val="single" w:color="F79646" w:themeColor="accent6" w:sz="4"/>
+            </w:tcBorders>
+            <w:tcMar/>
+            <w:vAlign w:val="center"/>
+          </w:tcPr>
+          <w:p>
+            <w:pPr>
+              <w:bidi w:val="0"/>
+              <w:spacing w:before="0" w:beforeAutospacing="off" w:after="0" w:afterAutospacing="off"/>
+              <w:jc w:val="center"/>
+            </w:pPr>
+            <w:r>
+              <w:rPr/>
+              <w:t xml:space="preserve">O </w:t>
+            </w:r>
+            <w:r>
+              <w:rPr/>
+              <w:t>sistema</w:t>
+            </w:r>
+            <w:r>
+              <w:rPr/>
+              <w:t xml:space="preserve"> </w:t>
+            </w:r>
+            <w:r>
+              <w:rPr/>
+              <w:t>deve</w:t>
+            </w:r>
+            <w:r>
+              <w:rPr/>
+              <w:t xml:space="preserve"> </w:t>
+            </w:r>
+            <w:r>
+              <w:rPr/>
+              <w:t>apresentar</w:t>
+            </w:r>
+            <w:r>
+              <w:rPr/>
+              <w:t xml:space="preserve"> </w:t>
+            </w:r>
+            <w:r>
+              <w:rPr/>
+              <w:t>uma</w:t>
+            </w:r>
+            <w:r>
+              <w:rPr/>
+              <w:t xml:space="preserve"> interface </w:t>
+            </w:r>
+            <w:r>
+              <w:rPr/>
+              <w:t>gráfica</w:t>
+            </w:r>
+            <w:r>
+              <w:rPr/>
+              <w:t xml:space="preserve"> </w:t>
+            </w:r>
+            <w:r>
+              <w:rPr/>
+              <w:t>interativa</w:t>
+            </w:r>
+            <w:r>
+              <w:rPr/>
+              <w:t xml:space="preserve"> com </w:t>
+            </w:r>
+            <w:r>
+              <w:rPr/>
+              <w:t>representação</w:t>
+            </w:r>
+            <w:r>
+              <w:rPr/>
+              <w:t xml:space="preserve"> do </w:t>
+            </w:r>
+            <w:r>
+              <w:rPr/>
+              <w:t>tabuleiro</w:t>
+            </w:r>
+            <w:r>
+              <w:rPr/>
+              <w:t>.</w:t>
+            </w:r>
+          </w:p>
+        </w:tc>
+      </w:tr>
+      <w:tr>
+        <w:trPr>
+          <w:trHeight w:val="300"/>
+        </w:trPr>
+        <w:tc>
+          <w:tcPr>
+            <w:cnfStyle w:val="001000000000" w:firstRow="0" w:lastRow="0" w:firstColumn="1" w:lastColumn="0" w:oddVBand="0" w:evenVBand="0" w:oddHBand="0" w:evenHBand="0" w:firstRowFirstColumn="0" w:firstRowLastColumn="0" w:lastRowFirstColumn="0" w:lastRowLastColumn="0"/>
+            <w:tcW w:w="1020" w:type="dxa"/>
+            <w:tcBorders>
+              <w:top w:val="single" w:color="F79646" w:themeColor="accent6" w:sz="4"/>
+              <w:left w:val="single" w:color="F79646" w:themeColor="accent6" w:sz="4"/>
+              <w:bottom w:val="single" w:color="F79646" w:themeColor="accent6" w:sz="4"/>
+              <w:right w:val="single" w:color="F79646" w:themeColor="accent6" w:sz="4"/>
+            </w:tcBorders>
+            <w:tcMar/>
+            <w:vAlign w:val="center"/>
+          </w:tcPr>
+          <w:p>
+            <w:pPr>
+              <w:bidi w:val="0"/>
+              <w:spacing w:before="0" w:beforeAutospacing="off" w:after="0" w:afterAutospacing="off"/>
+              <w:jc w:val="center"/>
+            </w:pPr>
+            <w:r>
+              <w:rPr/>
+              <w:t>RF10</w:t>
+            </w:r>
+          </w:p>
+        </w:tc>
+        <w:tc>
+          <w:tcPr>
+            <w:cnfStyle w:val="000000000000" w:firstRow="0" w:lastRow="0" w:firstColumn="0" w:lastColumn="0" w:oddVBand="0" w:evenVBand="0" w:oddHBand="0" w:evenHBand="0" w:firstRowFirstColumn="0" w:firstRowLastColumn="0" w:lastRowFirstColumn="0" w:lastRowLastColumn="0"/>
+            <w:tcW w:w="2850" w:type="dxa"/>
+            <w:tcBorders>
+              <w:top w:val="single" w:color="F79646" w:themeColor="accent6" w:sz="4"/>
+              <w:left w:val="single" w:color="F79646" w:themeColor="accent6" w:sz="4"/>
+              <w:bottom w:val="single" w:color="F79646" w:themeColor="accent6" w:sz="4"/>
+              <w:right w:val="single" w:color="F79646" w:themeColor="accent6" w:sz="4"/>
+            </w:tcBorders>
+            <w:tcMar/>
+            <w:vAlign w:val="center"/>
+          </w:tcPr>
+          <w:p>
+            <w:pPr>
+              <w:bidi w:val="0"/>
+              <w:spacing w:before="0" w:beforeAutospacing="off" w:after="0" w:afterAutospacing="off"/>
+              <w:jc w:val="center"/>
+            </w:pPr>
+            <w:r>
+              <w:rPr/>
+              <w:t>Animação</w:t>
+            </w:r>
+            <w:r>
+              <w:rPr/>
+              <w:t xml:space="preserve"> </w:t>
+            </w:r>
+            <w:r>
+              <w:rPr/>
+              <w:t>gráfica</w:t>
+            </w:r>
+          </w:p>
+        </w:tc>
+        <w:tc>
+          <w:tcPr>
+            <w:cnfStyle w:val="000000000000" w:firstRow="0" w:lastRow="0" w:firstColumn="0" w:lastColumn="0" w:oddVBand="0" w:evenVBand="0" w:oddHBand="0" w:evenHBand="0" w:firstRowFirstColumn="0" w:firstRowLastColumn="0" w:lastRowFirstColumn="0" w:lastRowLastColumn="0"/>
+            <w:tcW w:w="6155" w:type="dxa"/>
+            <w:tcBorders>
+              <w:top w:val="single" w:color="F79646" w:themeColor="accent6" w:sz="4"/>
+              <w:left w:val="single" w:color="F79646" w:themeColor="accent6" w:sz="4"/>
+              <w:bottom w:val="single" w:color="F79646" w:themeColor="accent6" w:sz="4"/>
+              <w:right w:val="single" w:color="F79646" w:themeColor="accent6" w:sz="4"/>
+            </w:tcBorders>
+            <w:tcMar/>
+            <w:vAlign w:val="center"/>
+          </w:tcPr>
+          <w:p>
+            <w:pPr>
+              <w:bidi w:val="0"/>
+              <w:spacing w:before="0" w:beforeAutospacing="off" w:after="0" w:afterAutospacing="off"/>
+              <w:jc w:val="center"/>
+            </w:pPr>
+            <w:r>
+              <w:rPr/>
+              <w:t xml:space="preserve">O </w:t>
+            </w:r>
+            <w:r>
+              <w:rPr/>
+              <w:t>sistema</w:t>
+            </w:r>
+            <w:r>
+              <w:rPr/>
+              <w:t xml:space="preserve"> </w:t>
+            </w:r>
+            <w:r>
+              <w:rPr/>
+              <w:t>deve</w:t>
+            </w:r>
+            <w:r>
+              <w:rPr/>
+              <w:t xml:space="preserve"> </w:t>
+            </w:r>
+            <w:r>
+              <w:rPr/>
+              <w:t>apresentar</w:t>
+            </w:r>
+            <w:r>
+              <w:rPr/>
+              <w:t xml:space="preserve"> </w:t>
+            </w:r>
+            <w:r>
+              <w:rPr/>
+              <w:t>animações</w:t>
+            </w:r>
+            <w:r>
+              <w:rPr/>
+              <w:t xml:space="preserve"> dos </w:t>
+            </w:r>
+            <w:r>
+              <w:rPr/>
+              <w:t>movimentos</w:t>
+            </w:r>
+            <w:r>
+              <w:rPr/>
+              <w:t xml:space="preserve"> das </w:t>
+            </w:r>
+            <w:r>
+              <w:rPr/>
+              <w:t>peças</w:t>
+            </w:r>
+            <w:r>
+              <w:rPr/>
+              <w:t>.</w:t>
+            </w:r>
+          </w:p>
+        </w:tc>
+      </w:tr>
+      <w:tr>
+        <w:trPr>
+          <w:trHeight w:val="300"/>
+        </w:trPr>
+        <w:tc>
+          <w:tcPr>
+            <w:cnfStyle w:val="001000000000" w:firstRow="0" w:lastRow="0" w:firstColumn="1" w:lastColumn="0" w:oddVBand="0" w:evenVBand="0" w:oddHBand="0" w:evenHBand="0" w:firstRowFirstColumn="0" w:firstRowLastColumn="0" w:lastRowFirstColumn="0" w:lastRowLastColumn="0"/>
+            <w:tcW w:w="1020" w:type="dxa"/>
+            <w:tcBorders>
+              <w:top w:val="single" w:color="F79646" w:themeColor="accent6" w:sz="4"/>
+              <w:left w:val="single" w:color="F79646" w:themeColor="accent6" w:sz="4"/>
+              <w:bottom w:val="single" w:color="F79646" w:themeColor="accent6" w:sz="4"/>
+              <w:right w:val="single" w:color="F79646" w:themeColor="accent6" w:sz="4"/>
+            </w:tcBorders>
+            <w:tcMar/>
+            <w:vAlign w:val="center"/>
+          </w:tcPr>
+          <w:p>
+            <w:pPr>
+              <w:bidi w:val="0"/>
+              <w:spacing w:before="0" w:beforeAutospacing="off" w:after="0" w:afterAutospacing="off"/>
+              <w:jc w:val="center"/>
+            </w:pPr>
+            <w:r>
+              <w:rPr/>
+              <w:t>RF11</w:t>
+            </w:r>
+          </w:p>
+        </w:tc>
+        <w:tc>
+          <w:tcPr>
+            <w:cnfStyle w:val="000000000000" w:firstRow="0" w:lastRow="0" w:firstColumn="0" w:lastColumn="0" w:oddVBand="0" w:evenVBand="0" w:oddHBand="0" w:evenHBand="0" w:firstRowFirstColumn="0" w:firstRowLastColumn="0" w:lastRowFirstColumn="0" w:lastRowLastColumn="0"/>
+            <w:tcW w:w="2850" w:type="dxa"/>
+            <w:tcBorders>
+              <w:top w:val="single" w:color="F79646" w:themeColor="accent6" w:sz="4"/>
+              <w:left w:val="single" w:color="F79646" w:themeColor="accent6" w:sz="4"/>
+              <w:bottom w:val="single" w:color="F79646" w:themeColor="accent6" w:sz="4"/>
+              <w:right w:val="single" w:color="F79646" w:themeColor="accent6" w:sz="4"/>
+            </w:tcBorders>
+            <w:tcMar/>
+            <w:vAlign w:val="center"/>
+          </w:tcPr>
+          <w:p>
+            <w:pPr>
+              <w:bidi w:val="0"/>
+              <w:spacing w:before="0" w:beforeAutospacing="off" w:after="0" w:afterAutospacing="off"/>
+              <w:jc w:val="center"/>
+            </w:pPr>
+            <w:r>
+              <w:rPr/>
+              <w:t xml:space="preserve">Jogo </w:t>
+            </w:r>
+            <w:r>
+              <w:rPr/>
+              <w:t>em</w:t>
+            </w:r>
+            <w:r>
+              <w:rPr/>
+              <w:t xml:space="preserve"> rede (LAN)</w:t>
+            </w:r>
+          </w:p>
+        </w:tc>
+        <w:tc>
+          <w:tcPr>
+            <w:cnfStyle w:val="000000000000" w:firstRow="0" w:lastRow="0" w:firstColumn="0" w:lastColumn="0" w:oddVBand="0" w:evenVBand="0" w:oddHBand="0" w:evenHBand="0" w:firstRowFirstColumn="0" w:firstRowLastColumn="0" w:lastRowFirstColumn="0" w:lastRowLastColumn="0"/>
+            <w:tcW w:w="6155" w:type="dxa"/>
+            <w:tcBorders>
+              <w:top w:val="single" w:color="F79646" w:themeColor="accent6" w:sz="4"/>
+              <w:left w:val="single" w:color="F79646" w:themeColor="accent6" w:sz="4"/>
+              <w:bottom w:val="single" w:color="F79646" w:themeColor="accent6" w:sz="4"/>
+              <w:right w:val="single" w:color="F79646" w:themeColor="accent6" w:sz="4"/>
+            </w:tcBorders>
+            <w:tcMar/>
+            <w:vAlign w:val="center"/>
+          </w:tcPr>
+          <w:p>
+            <w:pPr>
+              <w:bidi w:val="0"/>
+              <w:spacing w:before="0" w:beforeAutospacing="off" w:after="0" w:afterAutospacing="off"/>
+              <w:jc w:val="center"/>
+            </w:pPr>
+            <w:r>
+              <w:rPr/>
+              <w:t xml:space="preserve">O </w:t>
+            </w:r>
+            <w:r>
+              <w:rPr/>
+              <w:t>sistema</w:t>
+            </w:r>
+            <w:r>
+              <w:rPr/>
+              <w:t xml:space="preserve"> </w:t>
+            </w:r>
+            <w:r>
+              <w:rPr/>
+              <w:t>deve</w:t>
+            </w:r>
+            <w:r>
+              <w:rPr/>
+              <w:t xml:space="preserve"> </w:t>
+            </w:r>
+            <w:r>
+              <w:rPr/>
+              <w:t>permitir</w:t>
+            </w:r>
+            <w:r>
+              <w:rPr/>
+              <w:t xml:space="preserve"> </w:t>
+            </w:r>
+            <w:r>
+              <w:rPr/>
+              <w:t>a</w:t>
+            </w:r>
+            <w:r>
+              <w:rPr/>
+              <w:t xml:space="preserve"> </w:t>
+            </w:r>
+            <w:r>
+              <w:rPr/>
+              <w:t>interação</w:t>
+            </w:r>
+            <w:r>
+              <w:rPr/>
+              <w:t xml:space="preserve"> entre </w:t>
+            </w:r>
+            <w:r>
+              <w:rPr/>
+              <w:t>dois</w:t>
+            </w:r>
+            <w:r>
+              <w:rPr/>
+              <w:t xml:space="preserve"> </w:t>
+            </w:r>
+            <w:r>
+              <w:rPr/>
+              <w:t>jogadores</w:t>
+            </w:r>
+            <w:r>
+              <w:rPr/>
+              <w:t xml:space="preserve"> </w:t>
+            </w:r>
+            <w:r>
+              <w:rPr/>
+              <w:t>através</w:t>
+            </w:r>
+            <w:r>
+              <w:rPr/>
+              <w:t xml:space="preserve"> de rede local.</w:t>
+            </w:r>
+          </w:p>
+        </w:tc>
+      </w:tr>
+      <w:tr>
+        <w:trPr>
+          <w:trHeight w:val="300"/>
+        </w:trPr>
+        <w:tc>
+          <w:tcPr>
+            <w:cnfStyle w:val="001000000000" w:firstRow="0" w:lastRow="0" w:firstColumn="1" w:lastColumn="0" w:oddVBand="0" w:evenVBand="0" w:oddHBand="0" w:evenHBand="0" w:firstRowFirstColumn="0" w:firstRowLastColumn="0" w:lastRowFirstColumn="0" w:lastRowLastColumn="0"/>
+            <w:tcW w:w="1020" w:type="dxa"/>
+            <w:tcBorders>
+              <w:top w:val="single" w:color="F79646" w:themeColor="accent6" w:sz="4"/>
+              <w:left w:val="single" w:color="F79646" w:themeColor="accent6" w:sz="4"/>
+              <w:bottom w:val="single" w:color="F79646" w:themeColor="accent6" w:sz="4"/>
+              <w:right w:val="single" w:color="F79646" w:themeColor="accent6" w:sz="4"/>
+            </w:tcBorders>
+            <w:tcMar/>
+            <w:vAlign w:val="center"/>
+          </w:tcPr>
+          <w:p>
+            <w:pPr>
+              <w:bidi w:val="0"/>
+              <w:spacing w:before="0" w:beforeAutospacing="off" w:after="0" w:afterAutospacing="off"/>
+              <w:jc w:val="center"/>
+            </w:pPr>
+            <w:r>
+              <w:rPr/>
+              <w:t>RF12</w:t>
+            </w:r>
+          </w:p>
+        </w:tc>
+        <w:tc>
+          <w:tcPr>
+            <w:cnfStyle w:val="000000000000" w:firstRow="0" w:lastRow="0" w:firstColumn="0" w:lastColumn="0" w:oddVBand="0" w:evenVBand="0" w:oddHBand="0" w:evenHBand="0" w:firstRowFirstColumn="0" w:firstRowLastColumn="0" w:lastRowFirstColumn="0" w:lastRowLastColumn="0"/>
+            <w:tcW w:w="2850" w:type="dxa"/>
+            <w:tcBorders>
+              <w:top w:val="single" w:color="F79646" w:themeColor="accent6" w:sz="4"/>
+              <w:left w:val="single" w:color="F79646" w:themeColor="accent6" w:sz="4"/>
+              <w:bottom w:val="single" w:color="F79646" w:themeColor="accent6" w:sz="4"/>
+              <w:right w:val="single" w:color="F79646" w:themeColor="accent6" w:sz="4"/>
+            </w:tcBorders>
+            <w:tcMar/>
+            <w:vAlign w:val="center"/>
+          </w:tcPr>
+          <w:p>
+            <w:pPr>
+              <w:bidi w:val="0"/>
+              <w:spacing w:before="0" w:beforeAutospacing="off" w:after="0" w:afterAutospacing="off"/>
+              <w:jc w:val="center"/>
+            </w:pPr>
+            <w:r>
+              <w:rPr/>
+              <w:t>Enviar</w:t>
+            </w:r>
+            <w:r>
+              <w:rPr/>
+              <w:t xml:space="preserve"> </w:t>
+            </w:r>
+            <w:r>
+              <w:rPr/>
+              <w:t>jogadas</w:t>
+            </w:r>
+          </w:p>
+        </w:tc>
+        <w:tc>
+          <w:tcPr>
+            <w:cnfStyle w:val="000000000000" w:firstRow="0" w:lastRow="0" w:firstColumn="0" w:lastColumn="0" w:oddVBand="0" w:evenVBand="0" w:oddHBand="0" w:evenHBand="0" w:firstRowFirstColumn="0" w:firstRowLastColumn="0" w:lastRowFirstColumn="0" w:lastRowLastColumn="0"/>
+            <w:tcW w:w="6155" w:type="dxa"/>
+            <w:tcBorders>
+              <w:top w:val="single" w:color="F79646" w:themeColor="accent6" w:sz="4"/>
+              <w:left w:val="single" w:color="F79646" w:themeColor="accent6" w:sz="4"/>
+              <w:bottom w:val="single" w:color="F79646" w:themeColor="accent6" w:sz="4"/>
+              <w:right w:val="single" w:color="F79646" w:themeColor="accent6" w:sz="4"/>
+            </w:tcBorders>
+            <w:tcMar/>
+            <w:vAlign w:val="center"/>
+          </w:tcPr>
+          <w:p>
+            <w:pPr>
+              <w:bidi w:val="0"/>
+              <w:spacing w:before="0" w:beforeAutospacing="off" w:after="0" w:afterAutospacing="off"/>
+              <w:jc w:val="center"/>
+            </w:pPr>
+            <w:r>
+              <w:rPr/>
+              <w:t xml:space="preserve">O </w:t>
+            </w:r>
+            <w:r>
+              <w:rPr/>
+              <w:t>sistema</w:t>
+            </w:r>
+            <w:r>
+              <w:rPr/>
+              <w:t xml:space="preserve"> </w:t>
+            </w:r>
+            <w:r>
+              <w:rPr/>
+              <w:t>deve</w:t>
+            </w:r>
+            <w:r>
+              <w:rPr/>
+              <w:t xml:space="preserve"> </w:t>
+            </w:r>
+            <w:r>
+              <w:rPr/>
+              <w:t>enviar</w:t>
+            </w:r>
+            <w:r>
+              <w:rPr/>
+              <w:t xml:space="preserve"> as </w:t>
+            </w:r>
+            <w:r>
+              <w:rPr/>
+              <w:t>jogadas</w:t>
+            </w:r>
+            <w:r>
+              <w:rPr/>
+              <w:t xml:space="preserve"> </w:t>
+            </w:r>
+            <w:r>
+              <w:rPr/>
+              <w:t>realizadas</w:t>
+            </w:r>
+            <w:r>
+              <w:rPr/>
+              <w:t xml:space="preserve"> para o </w:t>
+            </w:r>
+            <w:r>
+              <w:rPr/>
+              <w:t>adversário</w:t>
+            </w:r>
+            <w:r>
+              <w:rPr/>
+              <w:t xml:space="preserve"> </w:t>
+            </w:r>
+            <w:r>
+              <w:rPr/>
+              <w:t>remoto</w:t>
+            </w:r>
+            <w:r>
+              <w:rPr/>
+              <w:t>.</w:t>
+            </w:r>
+          </w:p>
+        </w:tc>
+      </w:tr>
+      <w:tr>
+        <w:trPr>
+          <w:trHeight w:val="300"/>
+        </w:trPr>
+        <w:tc>
+          <w:tcPr>
+            <w:cnfStyle w:val="001000000000" w:firstRow="0" w:lastRow="0" w:firstColumn="1" w:lastColumn="0" w:oddVBand="0" w:evenVBand="0" w:oddHBand="0" w:evenHBand="0" w:firstRowFirstColumn="0" w:firstRowLastColumn="0" w:lastRowFirstColumn="0" w:lastRowLastColumn="0"/>
+            <w:tcW w:w="1020" w:type="dxa"/>
+            <w:tcBorders>
+              <w:top w:val="single" w:color="F79646" w:themeColor="accent6" w:sz="4"/>
+              <w:left w:val="single" w:color="F79646" w:themeColor="accent6" w:sz="4"/>
+              <w:bottom w:val="single" w:color="F79646" w:themeColor="accent6" w:sz="4"/>
+              <w:right w:val="single" w:color="F79646" w:themeColor="accent6" w:sz="4"/>
+            </w:tcBorders>
+            <w:tcMar/>
+            <w:vAlign w:val="center"/>
+          </w:tcPr>
+          <w:p>
+            <w:pPr>
+              <w:bidi w:val="0"/>
+              <w:spacing w:before="0" w:beforeAutospacing="off" w:after="0" w:afterAutospacing="off"/>
+              <w:jc w:val="center"/>
+            </w:pPr>
+            <w:r>
+              <w:rPr/>
+              <w:t>RF13</w:t>
+            </w:r>
+          </w:p>
+        </w:tc>
+        <w:tc>
+          <w:tcPr>
+            <w:cnfStyle w:val="000000000000" w:firstRow="0" w:lastRow="0" w:firstColumn="0" w:lastColumn="0" w:oddVBand="0" w:evenVBand="0" w:oddHBand="0" w:evenHBand="0" w:firstRowFirstColumn="0" w:firstRowLastColumn="0" w:lastRowFirstColumn="0" w:lastRowLastColumn="0"/>
+            <w:tcW w:w="2850" w:type="dxa"/>
+            <w:tcBorders>
+              <w:top w:val="single" w:color="F79646" w:themeColor="accent6" w:sz="4"/>
+              <w:left w:val="single" w:color="F79646" w:themeColor="accent6" w:sz="4"/>
+              <w:bottom w:val="single" w:color="F79646" w:themeColor="accent6" w:sz="4"/>
+              <w:right w:val="single" w:color="F79646" w:themeColor="accent6" w:sz="4"/>
+            </w:tcBorders>
+            <w:tcMar/>
+            <w:vAlign w:val="center"/>
+          </w:tcPr>
+          <w:p>
+            <w:pPr>
+              <w:bidi w:val="0"/>
+              <w:spacing w:before="0" w:beforeAutospacing="off" w:after="0" w:afterAutospacing="off"/>
+              <w:jc w:val="center"/>
+            </w:pPr>
+            <w:r>
+              <w:rPr/>
+              <w:t>Receber</w:t>
+            </w:r>
+            <w:r>
+              <w:rPr/>
+              <w:t xml:space="preserve"> </w:t>
+            </w:r>
+            <w:r>
+              <w:rPr/>
+              <w:t>jogadas</w:t>
+            </w:r>
+          </w:p>
+        </w:tc>
+        <w:tc>
+          <w:tcPr>
+            <w:cnfStyle w:val="000000000000" w:firstRow="0" w:lastRow="0" w:firstColumn="0" w:lastColumn="0" w:oddVBand="0" w:evenVBand="0" w:oddHBand="0" w:evenHBand="0" w:firstRowFirstColumn="0" w:firstRowLastColumn="0" w:lastRowFirstColumn="0" w:lastRowLastColumn="0"/>
+            <w:tcW w:w="6155" w:type="dxa"/>
+            <w:tcBorders>
+              <w:top w:val="single" w:color="F79646" w:themeColor="accent6" w:sz="4"/>
+              <w:left w:val="single" w:color="F79646" w:themeColor="accent6" w:sz="4"/>
+              <w:bottom w:val="single" w:color="F79646" w:themeColor="accent6" w:sz="4"/>
+              <w:right w:val="single" w:color="F79646" w:themeColor="accent6" w:sz="4"/>
+            </w:tcBorders>
+            <w:tcMar/>
+            <w:vAlign w:val="center"/>
+          </w:tcPr>
+          <w:p>
+            <w:pPr>
+              <w:bidi w:val="0"/>
+              <w:spacing w:before="0" w:beforeAutospacing="off" w:after="0" w:afterAutospacing="off"/>
+              <w:jc w:val="center"/>
+            </w:pPr>
+            <w:r>
+              <w:rPr/>
+              <w:t xml:space="preserve">O </w:t>
+            </w:r>
+            <w:r>
+              <w:rPr/>
+              <w:t>sistema</w:t>
+            </w:r>
+            <w:r>
+              <w:rPr/>
+              <w:t xml:space="preserve"> </w:t>
+            </w:r>
+            <w:r>
+              <w:rPr/>
+              <w:t>deve</w:t>
+            </w:r>
+            <w:r>
+              <w:rPr/>
+              <w:t xml:space="preserve"> </w:t>
+            </w:r>
+            <w:r>
+              <w:rPr/>
+              <w:t>receber</w:t>
+            </w:r>
+            <w:r>
+              <w:rPr/>
+              <w:t xml:space="preserve"> e </w:t>
+            </w:r>
+            <w:r>
+              <w:rPr/>
+              <w:t>aplicar</w:t>
+            </w:r>
+            <w:r>
+              <w:rPr/>
+              <w:t xml:space="preserve"> </w:t>
+            </w:r>
+            <w:r>
+              <w:rPr/>
+              <w:t>jogadas</w:t>
+            </w:r>
+            <w:r>
+              <w:rPr/>
+              <w:t xml:space="preserve"> do </w:t>
+            </w:r>
+            <w:r>
+              <w:rPr/>
+              <w:t>adversário</w:t>
+            </w:r>
+            <w:r>
+              <w:rPr/>
+              <w:t xml:space="preserve"> </w:t>
+            </w:r>
+            <w:r>
+              <w:rPr/>
+              <w:t>remoto</w:t>
+            </w:r>
+            <w:r>
+              <w:rPr/>
+              <w:t>.</w:t>
+            </w:r>
+          </w:p>
+        </w:tc>
+      </w:tr>
+      <w:tr>
+        <w:trPr>
+          <w:trHeight w:val="300"/>
+        </w:trPr>
+        <w:tc>
+          <w:tcPr>
+            <w:cnfStyle w:val="001000000000" w:firstRow="0" w:lastRow="0" w:firstColumn="1" w:lastColumn="0" w:oddVBand="0" w:evenVBand="0" w:oddHBand="0" w:evenHBand="0" w:firstRowFirstColumn="0" w:firstRowLastColumn="0" w:lastRowFirstColumn="0" w:lastRowLastColumn="0"/>
+            <w:tcW w:w="1020" w:type="dxa"/>
+            <w:tcBorders>
+              <w:top w:val="single" w:color="F79646" w:themeColor="accent6" w:sz="4"/>
+              <w:left w:val="single" w:color="F79646" w:themeColor="accent6" w:sz="4"/>
+              <w:bottom w:val="single" w:color="F79646" w:themeColor="accent6" w:sz="4"/>
+              <w:right w:val="single" w:color="F79646" w:themeColor="accent6" w:sz="4"/>
+            </w:tcBorders>
+            <w:tcMar/>
+            <w:vAlign w:val="center"/>
+          </w:tcPr>
+          <w:p>
+            <w:pPr>
+              <w:bidi w:val="0"/>
+              <w:spacing w:before="0" w:beforeAutospacing="off" w:after="0" w:afterAutospacing="off"/>
+              <w:jc w:val="center"/>
+            </w:pPr>
+            <w:r>
+              <w:rPr/>
+              <w:t>RF14</w:t>
+            </w:r>
+          </w:p>
+        </w:tc>
+        <w:tc>
+          <w:tcPr>
+            <w:cnfStyle w:val="000000000000" w:firstRow="0" w:lastRow="0" w:firstColumn="0" w:lastColumn="0" w:oddVBand="0" w:evenVBand="0" w:oddHBand="0" w:evenHBand="0" w:firstRowFirstColumn="0" w:firstRowLastColumn="0" w:lastRowFirstColumn="0" w:lastRowLastColumn="0"/>
+            <w:tcW w:w="2850" w:type="dxa"/>
+            <w:tcBorders>
+              <w:top w:val="single" w:color="F79646" w:themeColor="accent6" w:sz="4"/>
+              <w:left w:val="single" w:color="F79646" w:themeColor="accent6" w:sz="4"/>
+              <w:bottom w:val="single" w:color="F79646" w:themeColor="accent6" w:sz="4"/>
+              <w:right w:val="single" w:color="F79646" w:themeColor="accent6" w:sz="4"/>
+            </w:tcBorders>
+            <w:tcMar/>
+            <w:vAlign w:val="center"/>
+          </w:tcPr>
+          <w:p>
+            <w:pPr>
+              <w:bidi w:val="0"/>
+              <w:spacing w:before="0" w:beforeAutospacing="off" w:after="0" w:afterAutospacing="off"/>
+              <w:jc w:val="center"/>
+            </w:pPr>
+            <w:r>
+              <w:rPr/>
+              <w:t>Gravar</w:t>
+            </w:r>
+            <w:r>
+              <w:rPr/>
+              <w:t xml:space="preserve"> </w:t>
+            </w:r>
+            <w:r>
+              <w:rPr/>
+              <w:t>jogo</w:t>
+            </w:r>
+          </w:p>
+        </w:tc>
+        <w:tc>
+          <w:tcPr>
+            <w:cnfStyle w:val="000000000000" w:firstRow="0" w:lastRow="0" w:firstColumn="0" w:lastColumn="0" w:oddVBand="0" w:evenVBand="0" w:oddHBand="0" w:evenHBand="0" w:firstRowFirstColumn="0" w:firstRowLastColumn="0" w:lastRowFirstColumn="0" w:lastRowLastColumn="0"/>
+            <w:tcW w:w="6155" w:type="dxa"/>
+            <w:tcBorders>
+              <w:top w:val="single" w:color="F79646" w:themeColor="accent6" w:sz="4"/>
+              <w:left w:val="single" w:color="F79646" w:themeColor="accent6" w:sz="4"/>
+              <w:bottom w:val="single" w:color="F79646" w:themeColor="accent6" w:sz="4"/>
+              <w:right w:val="single" w:color="F79646" w:themeColor="accent6" w:sz="4"/>
+            </w:tcBorders>
+            <w:tcMar/>
+            <w:vAlign w:val="center"/>
+          </w:tcPr>
+          <w:p>
+            <w:pPr>
+              <w:bidi w:val="0"/>
+              <w:spacing w:before="0" w:beforeAutospacing="off" w:after="0" w:afterAutospacing="off"/>
+              <w:jc w:val="center"/>
+            </w:pPr>
+            <w:r>
+              <w:rPr/>
+              <w:t xml:space="preserve">O </w:t>
+            </w:r>
+            <w:r>
+              <w:rPr/>
+              <w:t>sistema</w:t>
+            </w:r>
+            <w:r>
+              <w:rPr/>
+              <w:t xml:space="preserve"> </w:t>
+            </w:r>
+            <w:r>
+              <w:rPr/>
+              <w:t>deve</w:t>
+            </w:r>
+            <w:r>
+              <w:rPr/>
+              <w:t xml:space="preserve"> </w:t>
+            </w:r>
+            <w:r>
+              <w:rPr/>
+              <w:t>permitir</w:t>
+            </w:r>
+            <w:r>
+              <w:rPr/>
+              <w:t xml:space="preserve"> </w:t>
+            </w:r>
+            <w:r>
+              <w:rPr/>
+              <w:t>guardar</w:t>
+            </w:r>
+            <w:r>
+              <w:rPr/>
+              <w:t xml:space="preserve"> o </w:t>
+            </w:r>
+            <w:r>
+              <w:rPr/>
+              <w:t>estado</w:t>
+            </w:r>
+            <w:r>
+              <w:rPr/>
+              <w:t xml:space="preserve"> </w:t>
+            </w:r>
+            <w:r>
+              <w:rPr/>
+              <w:t>atual</w:t>
+            </w:r>
+            <w:r>
+              <w:rPr/>
+              <w:t xml:space="preserve"> da </w:t>
+            </w:r>
+            <w:r>
+              <w:rPr/>
+              <w:t>partida</w:t>
+            </w:r>
+            <w:r>
+              <w:rPr/>
+              <w:t xml:space="preserve"> num </w:t>
+            </w:r>
+            <w:r>
+              <w:rPr/>
+              <w:t>ficheiro</w:t>
+            </w:r>
+            <w:r>
+              <w:rPr/>
+              <w:t>.</w:t>
+            </w:r>
+          </w:p>
+        </w:tc>
+      </w:tr>
+      <w:tr>
+        <w:trPr>
+          <w:trHeight w:val="300"/>
+        </w:trPr>
+        <w:tc>
+          <w:tcPr>
+            <w:cnfStyle w:val="001000000000" w:firstRow="0" w:lastRow="0" w:firstColumn="1" w:lastColumn="0" w:oddVBand="0" w:evenVBand="0" w:oddHBand="0" w:evenHBand="0" w:firstRowFirstColumn="0" w:firstRowLastColumn="0" w:lastRowFirstColumn="0" w:lastRowLastColumn="0"/>
+            <w:tcW w:w="1020" w:type="dxa"/>
+            <w:tcBorders>
+              <w:top w:val="single" w:color="F79646" w:themeColor="accent6" w:sz="4"/>
+              <w:left w:val="single" w:color="F79646" w:themeColor="accent6" w:sz="4"/>
+              <w:bottom w:val="single" w:color="F79646" w:themeColor="accent6" w:sz="4"/>
+              <w:right w:val="single" w:color="F79646" w:themeColor="accent6" w:sz="4"/>
+            </w:tcBorders>
+            <w:tcMar/>
+            <w:vAlign w:val="center"/>
+          </w:tcPr>
+          <w:p>
+            <w:pPr>
+              <w:bidi w:val="0"/>
+              <w:spacing w:before="0" w:beforeAutospacing="off" w:after="0" w:afterAutospacing="off"/>
+              <w:jc w:val="center"/>
+            </w:pPr>
+            <w:r>
+              <w:rPr/>
+              <w:t>RF15</w:t>
+            </w:r>
+          </w:p>
+        </w:tc>
+        <w:tc>
+          <w:tcPr>
+            <w:cnfStyle w:val="000000000000" w:firstRow="0" w:lastRow="0" w:firstColumn="0" w:lastColumn="0" w:oddVBand="0" w:evenVBand="0" w:oddHBand="0" w:evenHBand="0" w:firstRowFirstColumn="0" w:firstRowLastColumn="0" w:lastRowFirstColumn="0" w:lastRowLastColumn="0"/>
+            <w:tcW w:w="2850" w:type="dxa"/>
+            <w:tcBorders>
+              <w:top w:val="single" w:color="F79646" w:themeColor="accent6" w:sz="4"/>
+              <w:left w:val="single" w:color="F79646" w:themeColor="accent6" w:sz="4"/>
+              <w:bottom w:val="single" w:color="F79646" w:themeColor="accent6" w:sz="4"/>
+              <w:right w:val="single" w:color="F79646" w:themeColor="accent6" w:sz="4"/>
+            </w:tcBorders>
+            <w:tcMar/>
+            <w:vAlign w:val="center"/>
+          </w:tcPr>
+          <w:p>
+            <w:pPr>
+              <w:bidi w:val="0"/>
+              <w:spacing w:before="0" w:beforeAutospacing="off" w:after="0" w:afterAutospacing="off"/>
+              <w:jc w:val="center"/>
+            </w:pPr>
+            <w:r>
+              <w:rPr/>
+              <w:t>Carregar</w:t>
+            </w:r>
+            <w:r>
+              <w:rPr/>
+              <w:t xml:space="preserve"> </w:t>
+            </w:r>
+            <w:r>
+              <w:rPr/>
+              <w:t>jogo</w:t>
+            </w:r>
+          </w:p>
+        </w:tc>
+        <w:tc>
+          <w:tcPr>
+            <w:cnfStyle w:val="000000000000" w:firstRow="0" w:lastRow="0" w:firstColumn="0" w:lastColumn="0" w:oddVBand="0" w:evenVBand="0" w:oddHBand="0" w:evenHBand="0" w:firstRowFirstColumn="0" w:firstRowLastColumn="0" w:lastRowFirstColumn="0" w:lastRowLastColumn="0"/>
+            <w:tcW w:w="6155" w:type="dxa"/>
+            <w:tcBorders>
+              <w:top w:val="single" w:color="F79646" w:themeColor="accent6" w:sz="4"/>
+              <w:left w:val="single" w:color="F79646" w:themeColor="accent6" w:sz="4"/>
+              <w:bottom w:val="single" w:color="F79646" w:themeColor="accent6" w:sz="4"/>
+              <w:right w:val="single" w:color="F79646" w:themeColor="accent6" w:sz="4"/>
+            </w:tcBorders>
+            <w:tcMar/>
+            <w:vAlign w:val="center"/>
+          </w:tcPr>
+          <w:p>
+            <w:pPr>
+              <w:bidi w:val="0"/>
+              <w:spacing w:before="0" w:beforeAutospacing="off" w:after="0" w:afterAutospacing="off"/>
+              <w:jc w:val="center"/>
+            </w:pPr>
+            <w:r>
+              <w:rPr/>
+              <w:t xml:space="preserve">O </w:t>
+            </w:r>
+            <w:r>
+              <w:rPr/>
+              <w:t>sistema</w:t>
+            </w:r>
+            <w:r>
+              <w:rPr/>
+              <w:t xml:space="preserve"> </w:t>
+            </w:r>
+            <w:r>
+              <w:rPr/>
+              <w:t>deve</w:t>
+            </w:r>
+            <w:r>
+              <w:rPr/>
+              <w:t xml:space="preserve"> </w:t>
+            </w:r>
+            <w:r>
+              <w:rPr/>
+              <w:t>permitir</w:t>
+            </w:r>
+            <w:r>
+              <w:rPr/>
+              <w:t xml:space="preserve"> </w:t>
+            </w:r>
+            <w:r>
+              <w:rPr/>
+              <w:t>carregar</w:t>
+            </w:r>
+            <w:r>
+              <w:rPr/>
+              <w:t xml:space="preserve"> </w:t>
+            </w:r>
+            <w:r>
+              <w:rPr/>
+              <w:t>uma</w:t>
+            </w:r>
+            <w:r>
+              <w:rPr/>
+              <w:t xml:space="preserve"> </w:t>
+            </w:r>
+            <w:r>
+              <w:rPr/>
+              <w:t>partida</w:t>
+            </w:r>
+            <w:r>
+              <w:rPr/>
+              <w:t xml:space="preserve"> </w:t>
+            </w:r>
+            <w:r>
+              <w:rPr/>
+              <w:t>previamente</w:t>
+            </w:r>
+            <w:r>
+              <w:rPr/>
+              <w:t xml:space="preserve"> </w:t>
+            </w:r>
+            <w:r>
+              <w:rPr/>
+              <w:t>guardada</w:t>
+            </w:r>
+            <w:r>
+              <w:rPr/>
+              <w:t>.</w:t>
+            </w:r>
+          </w:p>
+        </w:tc>
+      </w:tr>
+      <w:tr>
+        <w:trPr>
+          <w:trHeight w:val="300"/>
+        </w:trPr>
+        <w:tc>
+          <w:tcPr>
+            <w:cnfStyle w:val="001000000000" w:firstRow="0" w:lastRow="0" w:firstColumn="1" w:lastColumn="0" w:oddVBand="0" w:evenVBand="0" w:oddHBand="0" w:evenHBand="0" w:firstRowFirstColumn="0" w:firstRowLastColumn="0" w:lastRowFirstColumn="0" w:lastRowLastColumn="0"/>
+            <w:tcW w:w="1020" w:type="dxa"/>
+            <w:tcBorders>
+              <w:top w:val="single" w:color="F79646" w:themeColor="accent6" w:sz="4"/>
+              <w:left w:val="single" w:color="F79646" w:themeColor="accent6" w:sz="4"/>
+              <w:bottom w:val="single" w:color="F79646" w:themeColor="accent6" w:sz="4"/>
+              <w:right w:val="single" w:color="F79646" w:themeColor="accent6" w:sz="4"/>
+            </w:tcBorders>
+            <w:tcMar/>
+            <w:vAlign w:val="center"/>
+          </w:tcPr>
+          <w:p>
+            <w:pPr>
+              <w:bidi w:val="0"/>
+              <w:spacing w:before="0" w:beforeAutospacing="off" w:after="0" w:afterAutospacing="off"/>
+              <w:jc w:val="center"/>
+            </w:pPr>
+            <w:r>
+              <w:rPr/>
+              <w:t>RF16</w:t>
+            </w:r>
+          </w:p>
+        </w:tc>
+        <w:tc>
+          <w:tcPr>
+            <w:cnfStyle w:val="000000000000" w:firstRow="0" w:lastRow="0" w:firstColumn="0" w:lastColumn="0" w:oddVBand="0" w:evenVBand="0" w:oddHBand="0" w:evenHBand="0" w:firstRowFirstColumn="0" w:firstRowLastColumn="0" w:lastRowFirstColumn="0" w:lastRowLastColumn="0"/>
+            <w:tcW w:w="2850" w:type="dxa"/>
+            <w:tcBorders>
+              <w:top w:val="single" w:color="F79646" w:themeColor="accent6" w:sz="4"/>
+              <w:left w:val="single" w:color="F79646" w:themeColor="accent6" w:sz="4"/>
+              <w:bottom w:val="single" w:color="F79646" w:themeColor="accent6" w:sz="4"/>
+              <w:right w:val="single" w:color="F79646" w:themeColor="accent6" w:sz="4"/>
+            </w:tcBorders>
+            <w:tcMar/>
+            <w:vAlign w:val="center"/>
+          </w:tcPr>
+          <w:p>
+            <w:pPr>
+              <w:bidi w:val="0"/>
+              <w:spacing w:before="0" w:beforeAutospacing="off" w:after="0" w:afterAutospacing="off"/>
+              <w:jc w:val="center"/>
+            </w:pPr>
+            <w:r>
+              <w:rPr/>
+              <w:t>Configurar</w:t>
+            </w:r>
+            <w:r>
+              <w:rPr/>
+              <w:t xml:space="preserve"> </w:t>
+            </w:r>
+            <w:r>
+              <w:rPr/>
+              <w:t>parâmetros</w:t>
+            </w:r>
+          </w:p>
+        </w:tc>
+        <w:tc>
+          <w:tcPr>
+            <w:cnfStyle w:val="000000000000" w:firstRow="0" w:lastRow="0" w:firstColumn="0" w:lastColumn="0" w:oddVBand="0" w:evenVBand="0" w:oddHBand="0" w:evenHBand="0" w:firstRowFirstColumn="0" w:firstRowLastColumn="0" w:lastRowFirstColumn="0" w:lastRowLastColumn="0"/>
+            <w:tcW w:w="6155" w:type="dxa"/>
+            <w:tcBorders>
+              <w:top w:val="single" w:color="F79646" w:themeColor="accent6" w:sz="4"/>
+              <w:left w:val="single" w:color="F79646" w:themeColor="accent6" w:sz="4"/>
+              <w:bottom w:val="single" w:color="F79646" w:themeColor="accent6" w:sz="4"/>
+              <w:right w:val="single" w:color="F79646" w:themeColor="accent6" w:sz="4"/>
+            </w:tcBorders>
+            <w:tcMar/>
+            <w:vAlign w:val="center"/>
+          </w:tcPr>
+          <w:p>
+            <w:pPr>
+              <w:bidi w:val="0"/>
+              <w:spacing w:before="0" w:beforeAutospacing="off" w:after="0" w:afterAutospacing="off"/>
+              <w:jc w:val="center"/>
+            </w:pPr>
+            <w:r>
+              <w:rPr/>
+              <w:t xml:space="preserve">O </w:t>
+            </w:r>
+            <w:r>
+              <w:rPr/>
+              <w:t>sistema</w:t>
+            </w:r>
+            <w:r>
+              <w:rPr/>
+              <w:t xml:space="preserve"> </w:t>
+            </w:r>
+            <w:r>
+              <w:rPr/>
+              <w:t>deve</w:t>
+            </w:r>
+            <w:r>
+              <w:rPr/>
+              <w:t xml:space="preserve"> </w:t>
+            </w:r>
+            <w:r>
+              <w:rPr/>
+              <w:t>permitir</w:t>
+            </w:r>
+            <w:r>
+              <w:rPr/>
+              <w:t xml:space="preserve"> </w:t>
+            </w:r>
+            <w:r>
+              <w:rPr/>
+              <w:t>definir</w:t>
+            </w:r>
+            <w:r>
+              <w:rPr/>
+              <w:t xml:space="preserve"> </w:t>
+            </w:r>
+            <w:r>
+              <w:rPr/>
+              <w:t>parâmetros</w:t>
+            </w:r>
+            <w:r>
+              <w:rPr/>
+              <w:t xml:space="preserve"> da </w:t>
+            </w:r>
+            <w:r>
+              <w:rPr/>
+              <w:t>partida</w:t>
+            </w:r>
+            <w:r>
+              <w:rPr/>
+              <w:t xml:space="preserve"> (</w:t>
+            </w:r>
+            <w:r>
+              <w:rPr/>
+              <w:t>nomes</w:t>
+            </w:r>
+            <w:r>
+              <w:rPr/>
+              <w:t>, cores, etc.).</w:t>
+            </w:r>
+          </w:p>
+        </w:tc>
+      </w:tr>
+    </w:tbl>
+    <w:p>
+      <w:pPr>
+        <w:pStyle w:val="Normal"/>
+        <w:suppressLineNumbers w:val="0"/>
+        <w:bidi w:val="0"/>
+        <w:spacing w:before="0" w:beforeAutospacing="off" w:after="200" w:afterAutospacing="off" w:line="276" w:lineRule="auto"/>
+        <w:ind w:left="0" w:right="0"/>
+        <w:jc w:val="left"/>
+        <w:rPr>
+          <w:noProof w:val="0"/>
+          <w:lang w:val="pt-BR"/>
+        </w:rPr>
+      </w:pPr>
+    </w:p>
+    <w:p>
+      <w:pPr>
+        <w:pStyle w:val="Heading1"/>
+        <w:ind w:left="0"/>
+      </w:pPr>
+      <w:r>
+        <w:rPr>
+          <w:noProof w:val="0"/>
+          <w:lang w:val="pt-BR"/>
+        </w:rPr>
+        <w:t>7. Requisitos Não Funcionais (RNF)</w:t>
+      </w:r>
+    </w:p>
+    <w:tbl>
+      <w:tblPr>
+        <w:tblStyle w:val="MediumGrid2-Accent6"/>
+        <w:tblW w:w="0" w:type="auto"/>
+        <w:tblLook w:val="06A0" w:firstRow="1" w:lastRow="0" w:firstColumn="1" w:lastColumn="0" w:noHBand="1" w:noVBand="1"/>
+      </w:tblPr>
+      <w:tblGrid>
+        <w:gridCol w:w="1125"/>
+        <w:gridCol w:w="2160"/>
+        <w:gridCol w:w="6920"/>
+      </w:tblGrid>
+      <w:tr>
+        <w:trPr>
+          <w:trHeight w:val="300"/>
+        </w:trPr>
+        <w:tc>
+          <w:tcPr>
+            <w:cnfStyle w:val="001000000100" w:firstRow="0" w:lastRow="0" w:firstColumn="1" w:lastColumn="0" w:oddVBand="0" w:evenVBand="0" w:oddHBand="0" w:evenHBand="0" w:firstRowFirstColumn="1" w:firstRowLastColumn="0" w:lastRowFirstColumn="0" w:lastRowLastColumn="0"/>
+            <w:tcW w:w="1125" w:type="dxa"/>
+            <w:tcBorders>
+              <w:top w:val="single" w:color="F79646" w:themeColor="accent6" w:sz="4"/>
+              <w:left w:val="single" w:color="F79646" w:themeColor="accent6" w:sz="4"/>
+              <w:bottom w:val="single" w:color="F79646" w:themeColor="accent6" w:sz="4"/>
+              <w:right w:val="single" w:color="F79646" w:themeColor="accent6" w:sz="4"/>
+            </w:tcBorders>
+            <w:tcMar/>
+          </w:tcPr>
+          <w:p>
+            <w:pPr>
+              <w:spacing w:before="0" w:beforeAutospacing="off" w:after="0" w:afterAutospacing="off"/>
+              <w:jc w:val="center"/>
+            </w:pPr>
+            <w:r>
+              <w:rPr>
+                <w:b w:val="1"/>
+                <w:bCs w:val="1"/>
+              </w:rPr>
+              <w:t>ID</w:t>
+            </w:r>
+          </w:p>
+        </w:tc>
+        <w:tc>
+          <w:tcPr>
+            <w:cnfStyle w:val="000000000000" w:firstRow="0" w:lastRow="0" w:firstColumn="0" w:lastColumn="0" w:oddVBand="0" w:evenVBand="0" w:oddHBand="0" w:evenHBand="0" w:firstRowFirstColumn="0" w:firstRowLastColumn="0" w:lastRowFirstColumn="0" w:lastRowLastColumn="0"/>
+            <w:tcW w:w="2160" w:type="dxa"/>
+            <w:tcBorders>
+              <w:top w:val="single" w:color="F79646" w:themeColor="accent6" w:sz="4"/>
+              <w:left w:val="single" w:color="F79646" w:themeColor="accent6" w:sz="4"/>
+              <w:bottom w:val="single" w:color="F79646" w:themeColor="accent6" w:sz="4"/>
+              <w:right w:val="single" w:color="F79646" w:themeColor="accent6" w:sz="4"/>
+            </w:tcBorders>
+            <w:tcMar/>
+          </w:tcPr>
+          <w:p>
+            <w:pPr>
+              <w:spacing w:before="0" w:beforeAutospacing="off" w:after="0" w:afterAutospacing="off"/>
+              <w:jc w:val="center"/>
+            </w:pPr>
+            <w:r>
+              <w:rPr>
+                <w:b w:val="1"/>
+                <w:bCs w:val="1"/>
+              </w:rPr>
+              <w:t>Categoria</w:t>
+            </w:r>
+          </w:p>
+        </w:tc>
+        <w:tc>
+          <w:tcPr>
+            <w:cnfStyle w:val="000000000000" w:firstRow="0" w:lastRow="0" w:firstColumn="0" w:lastColumn="0" w:oddVBand="0" w:evenVBand="0" w:oddHBand="0" w:evenHBand="0" w:firstRowFirstColumn="0" w:firstRowLastColumn="0" w:lastRowFirstColumn="0" w:lastRowLastColumn="0"/>
+            <w:tcW w:w="6920" w:type="dxa"/>
+            <w:tcBorders>
+              <w:top w:val="single" w:color="F79646" w:themeColor="accent6" w:sz="4"/>
+              <w:left w:val="single" w:color="F79646" w:themeColor="accent6" w:sz="4"/>
+              <w:bottom w:val="single" w:color="F79646" w:themeColor="accent6" w:sz="4"/>
+              <w:right w:val="single" w:color="F79646" w:themeColor="accent6" w:sz="4"/>
+            </w:tcBorders>
+            <w:tcMar/>
+          </w:tcPr>
+          <w:p>
+            <w:pPr>
+              <w:spacing w:before="0" w:beforeAutospacing="off" w:after="0" w:afterAutospacing="off"/>
+              <w:jc w:val="center"/>
+            </w:pPr>
+            <w:r>
+              <w:rPr>
+                <w:b w:val="1"/>
+                <w:bCs w:val="1"/>
+              </w:rPr>
+              <w:t>Descrição</w:t>
+            </w:r>
+          </w:p>
+        </w:tc>
+      </w:tr>
+      <w:tr>
+        <w:trPr>
+          <w:trHeight w:val="300"/>
+        </w:trPr>
+        <w:tc>
+          <w:tcPr>
+            <w:cnfStyle w:val="001000000000" w:firstRow="0" w:lastRow="0" w:firstColumn="1" w:lastColumn="0" w:oddVBand="0" w:evenVBand="0" w:oddHBand="0" w:evenHBand="0" w:firstRowFirstColumn="0" w:firstRowLastColumn="0" w:lastRowFirstColumn="0" w:lastRowLastColumn="0"/>
+            <w:tcW w:w="1125" w:type="dxa"/>
+            <w:tcBorders>
+              <w:top w:val="single" w:color="F79646" w:themeColor="accent6" w:sz="4"/>
+              <w:left w:val="single" w:color="F79646" w:themeColor="accent6" w:sz="4"/>
+              <w:bottom w:val="single" w:color="F79646" w:themeColor="accent6" w:sz="4"/>
+              <w:right w:val="single" w:color="F79646" w:themeColor="accent6" w:sz="4"/>
+            </w:tcBorders>
+            <w:tcMar/>
+          </w:tcPr>
+          <w:p>
+            <w:pPr>
+              <w:spacing w:before="0" w:beforeAutospacing="off" w:after="0" w:afterAutospacing="off"/>
+            </w:pPr>
+            <w:r>
+              <w:rPr/>
+              <w:t>RNF01</w:t>
+            </w:r>
+          </w:p>
+        </w:tc>
+        <w:tc>
+          <w:tcPr>
+            <w:cnfStyle w:val="000000000000" w:firstRow="0" w:lastRow="0" w:firstColumn="0" w:lastColumn="0" w:oddVBand="0" w:evenVBand="0" w:oddHBand="0" w:evenHBand="0" w:firstRowFirstColumn="0" w:firstRowLastColumn="0" w:lastRowFirstColumn="0" w:lastRowLastColumn="0"/>
+            <w:tcW w:w="2160" w:type="dxa"/>
+            <w:tcBorders>
+              <w:top w:val="single" w:color="F79646" w:themeColor="accent6" w:sz="4"/>
+              <w:left w:val="single" w:color="F79646" w:themeColor="accent6" w:sz="4"/>
+              <w:bottom w:val="single" w:color="F79646" w:themeColor="accent6" w:sz="4"/>
+              <w:right w:val="single" w:color="F79646" w:themeColor="accent6" w:sz="4"/>
+            </w:tcBorders>
+            <w:tcMar/>
+          </w:tcPr>
+          <w:p>
+            <w:pPr>
+              <w:spacing w:before="0" w:beforeAutospacing="off" w:after="0" w:afterAutospacing="off"/>
+            </w:pPr>
+            <w:r>
+              <w:rPr/>
+              <w:t>Linguagem</w:t>
+            </w:r>
+          </w:p>
+        </w:tc>
+        <w:tc>
+          <w:tcPr>
+            <w:cnfStyle w:val="000000000000" w:firstRow="0" w:lastRow="0" w:firstColumn="0" w:lastColumn="0" w:oddVBand="0" w:evenVBand="0" w:oddHBand="0" w:evenHBand="0" w:firstRowFirstColumn="0" w:firstRowLastColumn="0" w:lastRowFirstColumn="0" w:lastRowLastColumn="0"/>
+            <w:tcW w:w="6920" w:type="dxa"/>
+            <w:tcBorders>
+              <w:top w:val="single" w:color="F79646" w:themeColor="accent6" w:sz="4"/>
+              <w:left w:val="single" w:color="F79646" w:themeColor="accent6" w:sz="4"/>
+              <w:bottom w:val="single" w:color="F79646" w:themeColor="accent6" w:sz="4"/>
+              <w:right w:val="single" w:color="F79646" w:themeColor="accent6" w:sz="4"/>
+            </w:tcBorders>
+            <w:tcMar/>
+          </w:tcPr>
+          <w:p>
+            <w:pPr>
+              <w:spacing w:before="0" w:beforeAutospacing="off" w:after="0" w:afterAutospacing="off"/>
+            </w:pPr>
+            <w:r>
+              <w:rPr/>
+              <w:t>A aplicação deve ser desenvolvida em Java.</w:t>
+            </w:r>
+          </w:p>
+        </w:tc>
+      </w:tr>
+      <w:tr>
+        <w:trPr>
+          <w:trHeight w:val="300"/>
+        </w:trPr>
+        <w:tc>
+          <w:tcPr>
+            <w:cnfStyle w:val="001000000000" w:firstRow="0" w:lastRow="0" w:firstColumn="1" w:lastColumn="0" w:oddVBand="0" w:evenVBand="0" w:oddHBand="0" w:evenHBand="0" w:firstRowFirstColumn="0" w:firstRowLastColumn="0" w:lastRowFirstColumn="0" w:lastRowLastColumn="0"/>
+            <w:tcW w:w="1125" w:type="dxa"/>
+            <w:tcBorders>
+              <w:top w:val="single" w:color="F79646" w:themeColor="accent6" w:sz="4"/>
+              <w:left w:val="single" w:color="F79646" w:themeColor="accent6" w:sz="4"/>
+              <w:bottom w:val="single" w:color="F79646" w:themeColor="accent6" w:sz="4"/>
+              <w:right w:val="single" w:color="F79646" w:themeColor="accent6" w:sz="4"/>
+            </w:tcBorders>
+            <w:tcMar/>
+          </w:tcPr>
+          <w:p>
+            <w:pPr>
+              <w:spacing w:before="0" w:beforeAutospacing="off" w:after="0" w:afterAutospacing="off"/>
+            </w:pPr>
+            <w:r>
+              <w:rPr/>
+              <w:t>RNF02</w:t>
+            </w:r>
+          </w:p>
+        </w:tc>
+        <w:tc>
+          <w:tcPr>
+            <w:cnfStyle w:val="000000000000" w:firstRow="0" w:lastRow="0" w:firstColumn="0" w:lastColumn="0" w:oddVBand="0" w:evenVBand="0" w:oddHBand="0" w:evenHBand="0" w:firstRowFirstColumn="0" w:firstRowLastColumn="0" w:lastRowFirstColumn="0" w:lastRowLastColumn="0"/>
+            <w:tcW w:w="2160" w:type="dxa"/>
+            <w:tcBorders>
+              <w:top w:val="single" w:color="F79646" w:themeColor="accent6" w:sz="4"/>
+              <w:left w:val="single" w:color="F79646" w:themeColor="accent6" w:sz="4"/>
+              <w:bottom w:val="single" w:color="F79646" w:themeColor="accent6" w:sz="4"/>
+              <w:right w:val="single" w:color="F79646" w:themeColor="accent6" w:sz="4"/>
+            </w:tcBorders>
+            <w:tcMar/>
+          </w:tcPr>
+          <w:p>
+            <w:pPr>
+              <w:spacing w:before="0" w:beforeAutospacing="off" w:after="0" w:afterAutospacing="off"/>
+            </w:pPr>
+            <w:r>
+              <w:rPr/>
+              <w:t>Interface</w:t>
+            </w:r>
+          </w:p>
+        </w:tc>
+        <w:tc>
+          <w:tcPr>
+            <w:cnfStyle w:val="000000000000" w:firstRow="0" w:lastRow="0" w:firstColumn="0" w:lastColumn="0" w:oddVBand="0" w:evenVBand="0" w:oddHBand="0" w:evenHBand="0" w:firstRowFirstColumn="0" w:firstRowLastColumn="0" w:lastRowFirstColumn="0" w:lastRowLastColumn="0"/>
+            <w:tcW w:w="6920" w:type="dxa"/>
+            <w:tcBorders>
+              <w:top w:val="single" w:color="F79646" w:themeColor="accent6" w:sz="4"/>
+              <w:left w:val="single" w:color="F79646" w:themeColor="accent6" w:sz="4"/>
+              <w:bottom w:val="single" w:color="F79646" w:themeColor="accent6" w:sz="4"/>
+              <w:right w:val="single" w:color="F79646" w:themeColor="accent6" w:sz="4"/>
+            </w:tcBorders>
+            <w:tcMar/>
+          </w:tcPr>
+          <w:p>
+            <w:pPr>
+              <w:spacing w:before="0" w:beforeAutospacing="off" w:after="0" w:afterAutospacing="off"/>
+            </w:pPr>
+            <w:r>
+              <w:rPr/>
+              <w:t>A interface deve ser implementada com JavaFX.</w:t>
+            </w:r>
+          </w:p>
+        </w:tc>
+      </w:tr>
+      <w:tr>
+        <w:trPr>
+          <w:trHeight w:val="300"/>
+        </w:trPr>
+        <w:tc>
+          <w:tcPr>
+            <w:cnfStyle w:val="001000000000" w:firstRow="0" w:lastRow="0" w:firstColumn="1" w:lastColumn="0" w:oddVBand="0" w:evenVBand="0" w:oddHBand="0" w:evenHBand="0" w:firstRowFirstColumn="0" w:firstRowLastColumn="0" w:lastRowFirstColumn="0" w:lastRowLastColumn="0"/>
+            <w:tcW w:w="1125" w:type="dxa"/>
+            <w:tcBorders>
+              <w:top w:val="single" w:color="F79646" w:themeColor="accent6" w:sz="4"/>
+              <w:left w:val="single" w:color="F79646" w:themeColor="accent6" w:sz="4"/>
+              <w:bottom w:val="single" w:color="F79646" w:themeColor="accent6" w:sz="4"/>
+              <w:right w:val="single" w:color="F79646" w:themeColor="accent6" w:sz="4"/>
+            </w:tcBorders>
+            <w:tcMar/>
+          </w:tcPr>
+          <w:p>
+            <w:pPr>
+              <w:spacing w:before="0" w:beforeAutospacing="off" w:after="0" w:afterAutospacing="off"/>
+            </w:pPr>
+            <w:r>
+              <w:rPr/>
+              <w:t>RNF03</w:t>
+            </w:r>
+          </w:p>
+        </w:tc>
+        <w:tc>
+          <w:tcPr>
+            <w:cnfStyle w:val="000000000000" w:firstRow="0" w:lastRow="0" w:firstColumn="0" w:lastColumn="0" w:oddVBand="0" w:evenVBand="0" w:oddHBand="0" w:evenHBand="0" w:firstRowFirstColumn="0" w:firstRowLastColumn="0" w:lastRowFirstColumn="0" w:lastRowLastColumn="0"/>
+            <w:tcW w:w="2160" w:type="dxa"/>
+            <w:tcBorders>
+              <w:top w:val="single" w:color="F79646" w:themeColor="accent6" w:sz="4"/>
+              <w:left w:val="single" w:color="F79646" w:themeColor="accent6" w:sz="4"/>
+              <w:bottom w:val="single" w:color="F79646" w:themeColor="accent6" w:sz="4"/>
+              <w:right w:val="single" w:color="F79646" w:themeColor="accent6" w:sz="4"/>
+            </w:tcBorders>
+            <w:tcMar/>
+          </w:tcPr>
+          <w:p>
+            <w:pPr>
+              <w:spacing w:before="0" w:beforeAutospacing="off" w:after="0" w:afterAutospacing="off"/>
+            </w:pPr>
+            <w:r>
+              <w:rPr/>
+              <w:t>Usabilidade</w:t>
+            </w:r>
+          </w:p>
+        </w:tc>
+        <w:tc>
+          <w:tcPr>
+            <w:cnfStyle w:val="000000000000" w:firstRow="0" w:lastRow="0" w:firstColumn="0" w:lastColumn="0" w:oddVBand="0" w:evenVBand="0" w:oddHBand="0" w:evenHBand="0" w:firstRowFirstColumn="0" w:firstRowLastColumn="0" w:lastRowFirstColumn="0" w:lastRowLastColumn="0"/>
+            <w:tcW w:w="6920" w:type="dxa"/>
+            <w:tcBorders>
+              <w:top w:val="single" w:color="F79646" w:themeColor="accent6" w:sz="4"/>
+              <w:left w:val="single" w:color="F79646" w:themeColor="accent6" w:sz="4"/>
+              <w:bottom w:val="single" w:color="F79646" w:themeColor="accent6" w:sz="4"/>
+              <w:right w:val="single" w:color="F79646" w:themeColor="accent6" w:sz="4"/>
+            </w:tcBorders>
+            <w:tcMar/>
+          </w:tcPr>
+          <w:p>
+            <w:pPr>
+              <w:spacing w:before="0" w:beforeAutospacing="off" w:after="0" w:afterAutospacing="off"/>
+            </w:pPr>
+            <w:r>
+              <w:rPr/>
+              <w:t>A interface deve ser simples, intuitiva e de fácil utilização.</w:t>
+            </w:r>
+          </w:p>
+        </w:tc>
+      </w:tr>
+      <w:tr>
+        <w:trPr>
+          <w:trHeight w:val="300"/>
+        </w:trPr>
+        <w:tc>
+          <w:tcPr>
+            <w:cnfStyle w:val="001000000000" w:firstRow="0" w:lastRow="0" w:firstColumn="1" w:lastColumn="0" w:oddVBand="0" w:evenVBand="0" w:oddHBand="0" w:evenHBand="0" w:firstRowFirstColumn="0" w:firstRowLastColumn="0" w:lastRowFirstColumn="0" w:lastRowLastColumn="0"/>
+            <w:tcW w:w="1125" w:type="dxa"/>
+            <w:tcBorders>
+              <w:top w:val="single" w:color="F79646" w:themeColor="accent6" w:sz="4"/>
+              <w:left w:val="single" w:color="F79646" w:themeColor="accent6" w:sz="4"/>
+              <w:bottom w:val="single" w:color="F79646" w:themeColor="accent6" w:sz="4"/>
+              <w:right w:val="single" w:color="F79646" w:themeColor="accent6" w:sz="4"/>
+            </w:tcBorders>
+            <w:tcMar/>
+          </w:tcPr>
+          <w:p>
+            <w:pPr>
+              <w:spacing w:before="0" w:beforeAutospacing="off" w:after="0" w:afterAutospacing="off"/>
+            </w:pPr>
+            <w:r>
+              <w:rPr/>
+              <w:t>RNF04</w:t>
+            </w:r>
+          </w:p>
+        </w:tc>
+        <w:tc>
+          <w:tcPr>
+            <w:cnfStyle w:val="000000000000" w:firstRow="0" w:lastRow="0" w:firstColumn="0" w:lastColumn="0" w:oddVBand="0" w:evenVBand="0" w:oddHBand="0" w:evenHBand="0" w:firstRowFirstColumn="0" w:firstRowLastColumn="0" w:lastRowFirstColumn="0" w:lastRowLastColumn="0"/>
+            <w:tcW w:w="2160" w:type="dxa"/>
+            <w:tcBorders>
+              <w:top w:val="single" w:color="F79646" w:themeColor="accent6" w:sz="4"/>
+              <w:left w:val="single" w:color="F79646" w:themeColor="accent6" w:sz="4"/>
+              <w:bottom w:val="single" w:color="F79646" w:themeColor="accent6" w:sz="4"/>
+              <w:right w:val="single" w:color="F79646" w:themeColor="accent6" w:sz="4"/>
+            </w:tcBorders>
+            <w:tcMar/>
+          </w:tcPr>
+          <w:p>
+            <w:pPr>
+              <w:spacing w:before="0" w:beforeAutospacing="off" w:after="0" w:afterAutospacing="off"/>
+            </w:pPr>
+            <w:r>
+              <w:rPr/>
+              <w:t>Desempenho</w:t>
+            </w:r>
+          </w:p>
+        </w:tc>
+        <w:tc>
+          <w:tcPr>
+            <w:cnfStyle w:val="000000000000" w:firstRow="0" w:lastRow="0" w:firstColumn="0" w:lastColumn="0" w:oddVBand="0" w:evenVBand="0" w:oddHBand="0" w:evenHBand="0" w:firstRowFirstColumn="0" w:firstRowLastColumn="0" w:lastRowFirstColumn="0" w:lastRowLastColumn="0"/>
+            <w:tcW w:w="6920" w:type="dxa"/>
+            <w:tcBorders>
+              <w:top w:val="single" w:color="F79646" w:themeColor="accent6" w:sz="4"/>
+              <w:left w:val="single" w:color="F79646" w:themeColor="accent6" w:sz="4"/>
+              <w:bottom w:val="single" w:color="F79646" w:themeColor="accent6" w:sz="4"/>
+              <w:right w:val="single" w:color="F79646" w:themeColor="accent6" w:sz="4"/>
+            </w:tcBorders>
+            <w:tcMar/>
+          </w:tcPr>
+          <w:p>
+            <w:pPr>
+              <w:spacing w:before="0" w:beforeAutospacing="off" w:after="0" w:afterAutospacing="off"/>
+            </w:pPr>
+            <w:r>
+              <w:rPr/>
+              <w:t>O sistema deve responder às ações do utilizador sem latência percetível.</w:t>
+            </w:r>
+          </w:p>
+        </w:tc>
+      </w:tr>
+      <w:tr>
+        <w:trPr>
+          <w:trHeight w:val="300"/>
+        </w:trPr>
+        <w:tc>
+          <w:tcPr>
+            <w:cnfStyle w:val="001000000000" w:firstRow="0" w:lastRow="0" w:firstColumn="1" w:lastColumn="0" w:oddVBand="0" w:evenVBand="0" w:oddHBand="0" w:evenHBand="0" w:firstRowFirstColumn="0" w:firstRowLastColumn="0" w:lastRowFirstColumn="0" w:lastRowLastColumn="0"/>
+            <w:tcW w:w="1125" w:type="dxa"/>
+            <w:tcBorders>
+              <w:top w:val="single" w:color="F79646" w:themeColor="accent6" w:sz="4"/>
+              <w:left w:val="single" w:color="F79646" w:themeColor="accent6" w:sz="4"/>
+              <w:bottom w:val="single" w:color="F79646" w:themeColor="accent6" w:sz="4"/>
+              <w:right w:val="single" w:color="F79646" w:themeColor="accent6" w:sz="4"/>
+            </w:tcBorders>
+            <w:tcMar/>
+          </w:tcPr>
+          <w:p>
+            <w:pPr>
+              <w:spacing w:before="0" w:beforeAutospacing="off" w:after="0" w:afterAutospacing="off"/>
+            </w:pPr>
+            <w:r>
+              <w:rPr/>
+              <w:t>RNF05</w:t>
+            </w:r>
+          </w:p>
+        </w:tc>
+        <w:tc>
+          <w:tcPr>
+            <w:cnfStyle w:val="000000000000" w:firstRow="0" w:lastRow="0" w:firstColumn="0" w:lastColumn="0" w:oddVBand="0" w:evenVBand="0" w:oddHBand="0" w:evenHBand="0" w:firstRowFirstColumn="0" w:firstRowLastColumn="0" w:lastRowFirstColumn="0" w:lastRowLastColumn="0"/>
+            <w:tcW w:w="2160" w:type="dxa"/>
+            <w:tcBorders>
+              <w:top w:val="single" w:color="F79646" w:themeColor="accent6" w:sz="4"/>
+              <w:left w:val="single" w:color="F79646" w:themeColor="accent6" w:sz="4"/>
+              <w:bottom w:val="single" w:color="F79646" w:themeColor="accent6" w:sz="4"/>
+              <w:right w:val="single" w:color="F79646" w:themeColor="accent6" w:sz="4"/>
+            </w:tcBorders>
+            <w:tcMar/>
+          </w:tcPr>
+          <w:p>
+            <w:pPr>
+              <w:spacing w:before="0" w:beforeAutospacing="off" w:after="0" w:afterAutospacing="off"/>
+            </w:pPr>
+            <w:r>
+              <w:rPr/>
+              <w:t>Portabilidade</w:t>
+            </w:r>
+          </w:p>
+        </w:tc>
+        <w:tc>
+          <w:tcPr>
+            <w:cnfStyle w:val="000000000000" w:firstRow="0" w:lastRow="0" w:firstColumn="0" w:lastColumn="0" w:oddVBand="0" w:evenVBand="0" w:oddHBand="0" w:evenHBand="0" w:firstRowFirstColumn="0" w:firstRowLastColumn="0" w:lastRowFirstColumn="0" w:lastRowLastColumn="0"/>
+            <w:tcW w:w="6920" w:type="dxa"/>
+            <w:tcBorders>
+              <w:top w:val="single" w:color="F79646" w:themeColor="accent6" w:sz="4"/>
+              <w:left w:val="single" w:color="F79646" w:themeColor="accent6" w:sz="4"/>
+              <w:bottom w:val="single" w:color="F79646" w:themeColor="accent6" w:sz="4"/>
+              <w:right w:val="single" w:color="F79646" w:themeColor="accent6" w:sz="4"/>
+            </w:tcBorders>
+            <w:tcMar/>
+          </w:tcPr>
+          <w:p>
+            <w:pPr>
+              <w:spacing w:before="0" w:beforeAutospacing="off" w:after="0" w:afterAutospacing="off"/>
+            </w:pPr>
+            <w:r>
+              <w:rPr/>
+              <w:t>A aplicação deve executar em sistemas com OpenJDK compatível.</w:t>
+            </w:r>
+          </w:p>
+        </w:tc>
+      </w:tr>
+      <w:tr>
+        <w:trPr>
+          <w:trHeight w:val="300"/>
+        </w:trPr>
+        <w:tc>
+          <w:tcPr>
+            <w:cnfStyle w:val="001000000000" w:firstRow="0" w:lastRow="0" w:firstColumn="1" w:lastColumn="0" w:oddVBand="0" w:evenVBand="0" w:oddHBand="0" w:evenHBand="0" w:firstRowFirstColumn="0" w:firstRowLastColumn="0" w:lastRowFirstColumn="0" w:lastRowLastColumn="0"/>
+            <w:tcW w:w="1125" w:type="dxa"/>
+            <w:tcBorders>
+              <w:top w:val="single" w:color="F79646" w:themeColor="accent6" w:sz="4"/>
+              <w:left w:val="single" w:color="F79646" w:themeColor="accent6" w:sz="4"/>
+              <w:bottom w:val="single" w:color="F79646" w:themeColor="accent6" w:sz="4"/>
+              <w:right w:val="single" w:color="F79646" w:themeColor="accent6" w:sz="4"/>
+            </w:tcBorders>
+            <w:tcMar/>
+          </w:tcPr>
+          <w:p>
+            <w:pPr>
+              <w:spacing w:before="0" w:beforeAutospacing="off" w:after="0" w:afterAutospacing="off"/>
+            </w:pPr>
+            <w:r>
+              <w:rPr/>
+              <w:t>RNF06</w:t>
+            </w:r>
+          </w:p>
+        </w:tc>
+        <w:tc>
+          <w:tcPr>
+            <w:cnfStyle w:val="000000000000" w:firstRow="0" w:lastRow="0" w:firstColumn="0" w:lastColumn="0" w:oddVBand="0" w:evenVBand="0" w:oddHBand="0" w:evenHBand="0" w:firstRowFirstColumn="0" w:firstRowLastColumn="0" w:lastRowFirstColumn="0" w:lastRowLastColumn="0"/>
+            <w:tcW w:w="2160" w:type="dxa"/>
+            <w:tcBorders>
+              <w:top w:val="single" w:color="F79646" w:themeColor="accent6" w:sz="4"/>
+              <w:left w:val="single" w:color="F79646" w:themeColor="accent6" w:sz="4"/>
+              <w:bottom w:val="single" w:color="F79646" w:themeColor="accent6" w:sz="4"/>
+              <w:right w:val="single" w:color="F79646" w:themeColor="accent6" w:sz="4"/>
+            </w:tcBorders>
+            <w:tcMar/>
+          </w:tcPr>
+          <w:p>
+            <w:pPr>
+              <w:spacing w:before="0" w:beforeAutospacing="off" w:after="0" w:afterAutospacing="off"/>
+            </w:pPr>
+            <w:r>
+              <w:rPr/>
+              <w:t>Persistência</w:t>
+            </w:r>
+          </w:p>
+        </w:tc>
+        <w:tc>
+          <w:tcPr>
+            <w:cnfStyle w:val="000000000000" w:firstRow="0" w:lastRow="0" w:firstColumn="0" w:lastColumn="0" w:oddVBand="0" w:evenVBand="0" w:oddHBand="0" w:evenHBand="0" w:firstRowFirstColumn="0" w:firstRowLastColumn="0" w:lastRowFirstColumn="0" w:lastRowLastColumn="0"/>
+            <w:tcW w:w="6920" w:type="dxa"/>
+            <w:tcBorders>
+              <w:top w:val="single" w:color="F79646" w:themeColor="accent6" w:sz="4"/>
+              <w:left w:val="single" w:color="F79646" w:themeColor="accent6" w:sz="4"/>
+              <w:bottom w:val="single" w:color="F79646" w:themeColor="accent6" w:sz="4"/>
+              <w:right w:val="single" w:color="F79646" w:themeColor="accent6" w:sz="4"/>
+            </w:tcBorders>
+            <w:tcMar/>
+          </w:tcPr>
+          <w:p>
+            <w:pPr>
+              <w:spacing w:before="0" w:beforeAutospacing="off" w:after="0" w:afterAutospacing="off"/>
+            </w:pPr>
+            <w:r>
+              <w:rPr/>
+              <w:t>O estado do jogo deve ser armazenado de forma consistente entre execuções.</w:t>
+            </w:r>
+          </w:p>
+        </w:tc>
+      </w:tr>
+      <w:tr>
+        <w:trPr>
+          <w:trHeight w:val="300"/>
+        </w:trPr>
+        <w:tc>
+          <w:tcPr>
+            <w:cnfStyle w:val="001000000000" w:firstRow="0" w:lastRow="0" w:firstColumn="1" w:lastColumn="0" w:oddVBand="0" w:evenVBand="0" w:oddHBand="0" w:evenHBand="0" w:firstRowFirstColumn="0" w:firstRowLastColumn="0" w:lastRowFirstColumn="0" w:lastRowLastColumn="0"/>
+            <w:tcW w:w="1125" w:type="dxa"/>
+            <w:tcBorders>
+              <w:top w:val="single" w:color="F79646" w:themeColor="accent6" w:sz="4"/>
+              <w:left w:val="single" w:color="F79646" w:themeColor="accent6" w:sz="4"/>
+              <w:bottom w:val="single" w:color="F79646" w:themeColor="accent6" w:sz="4"/>
+              <w:right w:val="single" w:color="F79646" w:themeColor="accent6" w:sz="4"/>
+            </w:tcBorders>
+            <w:tcMar/>
+          </w:tcPr>
+          <w:p>
+            <w:pPr>
+              <w:spacing w:before="0" w:beforeAutospacing="off" w:after="0" w:afterAutospacing="off"/>
+            </w:pPr>
+            <w:r>
+              <w:rPr/>
+              <w:t>RNF07</w:t>
+            </w:r>
+          </w:p>
+        </w:tc>
+        <w:tc>
+          <w:tcPr>
+            <w:cnfStyle w:val="000000000000" w:firstRow="0" w:lastRow="0" w:firstColumn="0" w:lastColumn="0" w:oddVBand="0" w:evenVBand="0" w:oddHBand="0" w:evenHBand="0" w:firstRowFirstColumn="0" w:firstRowLastColumn="0" w:lastRowFirstColumn="0" w:lastRowLastColumn="0"/>
+            <w:tcW w:w="2160" w:type="dxa"/>
+            <w:tcBorders>
+              <w:top w:val="single" w:color="F79646" w:themeColor="accent6" w:sz="4"/>
+              <w:left w:val="single" w:color="F79646" w:themeColor="accent6" w:sz="4"/>
+              <w:bottom w:val="single" w:color="F79646" w:themeColor="accent6" w:sz="4"/>
+              <w:right w:val="single" w:color="F79646" w:themeColor="accent6" w:sz="4"/>
+            </w:tcBorders>
+            <w:tcMar/>
+          </w:tcPr>
+          <w:p>
+            <w:pPr>
+              <w:spacing w:before="0" w:beforeAutospacing="off" w:after="0" w:afterAutospacing="off"/>
+            </w:pPr>
+            <w:r>
+              <w:rPr/>
+              <w:t>Manutenibilidade</w:t>
+            </w:r>
+          </w:p>
+        </w:tc>
+        <w:tc>
+          <w:tcPr>
+            <w:cnfStyle w:val="000000000000" w:firstRow="0" w:lastRow="0" w:firstColumn="0" w:lastColumn="0" w:oddVBand="0" w:evenVBand="0" w:oddHBand="0" w:evenHBand="0" w:firstRowFirstColumn="0" w:firstRowLastColumn="0" w:lastRowFirstColumn="0" w:lastRowLastColumn="0"/>
+            <w:tcW w:w="6920" w:type="dxa"/>
+            <w:tcBorders>
+              <w:top w:val="single" w:color="F79646" w:themeColor="accent6" w:sz="4"/>
+              <w:left w:val="single" w:color="F79646" w:themeColor="accent6" w:sz="4"/>
+              <w:bottom w:val="single" w:color="F79646" w:themeColor="accent6" w:sz="4"/>
+              <w:right w:val="single" w:color="F79646" w:themeColor="accent6" w:sz="4"/>
+            </w:tcBorders>
+            <w:tcMar/>
+          </w:tcPr>
+          <w:p>
+            <w:pPr>
+              <w:spacing w:before="0" w:beforeAutospacing="off" w:after="0" w:afterAutospacing="off"/>
+            </w:pPr>
+            <w:r>
+              <w:rPr/>
+              <w:t>O código deve ser modular, organizado e documentado.</w:t>
+            </w:r>
+          </w:p>
+        </w:tc>
+      </w:tr>
+      <w:tr>
+        <w:trPr>
+          <w:trHeight w:val="300"/>
+        </w:trPr>
+        <w:tc>
+          <w:tcPr>
+            <w:cnfStyle w:val="001000000000" w:firstRow="0" w:lastRow="0" w:firstColumn="1" w:lastColumn="0" w:oddVBand="0" w:evenVBand="0" w:oddHBand="0" w:evenHBand="0" w:firstRowFirstColumn="0" w:firstRowLastColumn="0" w:lastRowFirstColumn="0" w:lastRowLastColumn="0"/>
+            <w:tcW w:w="1125" w:type="dxa"/>
+            <w:tcBorders>
+              <w:top w:val="single" w:color="F79646" w:themeColor="accent6" w:sz="4"/>
+              <w:left w:val="single" w:color="F79646" w:themeColor="accent6" w:sz="4"/>
+              <w:bottom w:val="single" w:color="F79646" w:themeColor="accent6" w:sz="4"/>
+              <w:right w:val="single" w:color="F79646" w:themeColor="accent6" w:sz="4"/>
+            </w:tcBorders>
+            <w:tcMar/>
+          </w:tcPr>
+          <w:p>
+            <w:pPr>
+              <w:spacing w:before="0" w:beforeAutospacing="off" w:after="0" w:afterAutospacing="off"/>
+            </w:pPr>
+            <w:r>
+              <w:rPr/>
+              <w:t>RNF08</w:t>
+            </w:r>
+          </w:p>
+        </w:tc>
+        <w:tc>
+          <w:tcPr>
+            <w:cnfStyle w:val="000000000000" w:firstRow="0" w:lastRow="0" w:firstColumn="0" w:lastColumn="0" w:oddVBand="0" w:evenVBand="0" w:oddHBand="0" w:evenHBand="0" w:firstRowFirstColumn="0" w:firstRowLastColumn="0" w:lastRowFirstColumn="0" w:lastRowLastColumn="0"/>
+            <w:tcW w:w="2160" w:type="dxa"/>
+            <w:tcBorders>
+              <w:top w:val="single" w:color="F79646" w:themeColor="accent6" w:sz="4"/>
+              <w:left w:val="single" w:color="F79646" w:themeColor="accent6" w:sz="4"/>
+              <w:bottom w:val="single" w:color="F79646" w:themeColor="accent6" w:sz="4"/>
+              <w:right w:val="single" w:color="F79646" w:themeColor="accent6" w:sz="4"/>
+            </w:tcBorders>
+            <w:tcMar/>
+          </w:tcPr>
+          <w:p>
+            <w:pPr>
+              <w:spacing w:before="0" w:beforeAutospacing="off" w:after="0" w:afterAutospacing="off"/>
+            </w:pPr>
+            <w:r>
+              <w:rPr/>
+              <w:t>Versionamento</w:t>
+            </w:r>
+          </w:p>
+        </w:tc>
+        <w:tc>
+          <w:tcPr>
+            <w:cnfStyle w:val="000000000000" w:firstRow="0" w:lastRow="0" w:firstColumn="0" w:lastColumn="0" w:oddVBand="0" w:evenVBand="0" w:oddHBand="0" w:evenHBand="0" w:firstRowFirstColumn="0" w:firstRowLastColumn="0" w:lastRowFirstColumn="0" w:lastRowLastColumn="0"/>
+            <w:tcW w:w="6920" w:type="dxa"/>
+            <w:tcBorders>
+              <w:top w:val="single" w:color="F79646" w:themeColor="accent6" w:sz="4"/>
+              <w:left w:val="single" w:color="F79646" w:themeColor="accent6" w:sz="4"/>
+              <w:bottom w:val="single" w:color="F79646" w:themeColor="accent6" w:sz="4"/>
+              <w:right w:val="single" w:color="F79646" w:themeColor="accent6" w:sz="4"/>
+            </w:tcBorders>
+            <w:tcMar/>
+          </w:tcPr>
+          <w:p>
+            <w:pPr>
+              <w:spacing w:before="0" w:beforeAutospacing="off" w:after="0" w:afterAutospacing="off"/>
+            </w:pPr>
+            <w:r>
+              <w:rPr/>
+              <w:t>O projeto deve utilizar um sistema de controlo de versões (Git).</w:t>
+            </w:r>
+          </w:p>
+        </w:tc>
+      </w:tr>
+      <w:tr>
+        <w:trPr>
+          <w:trHeight w:val="300"/>
+        </w:trPr>
+        <w:tc>
+          <w:tcPr>
+            <w:cnfStyle w:val="001000000000" w:firstRow="0" w:lastRow="0" w:firstColumn="1" w:lastColumn="0" w:oddVBand="0" w:evenVBand="0" w:oddHBand="0" w:evenHBand="0" w:firstRowFirstColumn="0" w:firstRowLastColumn="0" w:lastRowFirstColumn="0" w:lastRowLastColumn="0"/>
+            <w:tcW w:w="1125" w:type="dxa"/>
+            <w:tcBorders>
+              <w:top w:val="single" w:color="F79646" w:themeColor="accent6" w:sz="4"/>
+              <w:left w:val="single" w:color="F79646" w:themeColor="accent6" w:sz="4"/>
+              <w:bottom w:val="single" w:color="F79646" w:themeColor="accent6" w:sz="4"/>
+              <w:right w:val="single" w:color="F79646" w:themeColor="accent6" w:sz="4"/>
+            </w:tcBorders>
+            <w:tcMar/>
+          </w:tcPr>
+          <w:p>
+            <w:pPr>
+              <w:spacing w:before="0" w:beforeAutospacing="off" w:after="0" w:afterAutospacing="off"/>
+            </w:pPr>
+            <w:r>
+              <w:rPr/>
+              <w:t>RNF09</w:t>
+            </w:r>
+          </w:p>
+        </w:tc>
+        <w:tc>
+          <w:tcPr>
+            <w:cnfStyle w:val="000000000000" w:firstRow="0" w:lastRow="0" w:firstColumn="0" w:lastColumn="0" w:oddVBand="0" w:evenVBand="0" w:oddHBand="0" w:evenHBand="0" w:firstRowFirstColumn="0" w:firstRowLastColumn="0" w:lastRowFirstColumn="0" w:lastRowLastColumn="0"/>
+            <w:tcW w:w="2160" w:type="dxa"/>
+            <w:tcBorders>
+              <w:top w:val="single" w:color="F79646" w:themeColor="accent6" w:sz="4"/>
+              <w:left w:val="single" w:color="F79646" w:themeColor="accent6" w:sz="4"/>
+              <w:bottom w:val="single" w:color="F79646" w:themeColor="accent6" w:sz="4"/>
+              <w:right w:val="single" w:color="F79646" w:themeColor="accent6" w:sz="4"/>
+            </w:tcBorders>
+            <w:tcMar/>
+          </w:tcPr>
+          <w:p>
+            <w:pPr>
+              <w:spacing w:before="0" w:beforeAutospacing="off" w:after="0" w:afterAutospacing="off"/>
+            </w:pPr>
+            <w:r>
+              <w:rPr/>
+              <w:t>Conformidade</w:t>
+            </w:r>
+          </w:p>
+        </w:tc>
+        <w:tc>
+          <w:tcPr>
+            <w:cnfStyle w:val="000000000000" w:firstRow="0" w:lastRow="0" w:firstColumn="0" w:lastColumn="0" w:oddVBand="0" w:evenVBand="0" w:oddHBand="0" w:evenHBand="0" w:firstRowFirstColumn="0" w:firstRowLastColumn="0" w:lastRowFirstColumn="0" w:lastRowLastColumn="0"/>
+            <w:tcW w:w="6920" w:type="dxa"/>
+            <w:tcBorders>
+              <w:top w:val="single" w:color="F79646" w:themeColor="accent6" w:sz="4"/>
+              <w:left w:val="single" w:color="F79646" w:themeColor="accent6" w:sz="4"/>
+              <w:bottom w:val="single" w:color="F79646" w:themeColor="accent6" w:sz="4"/>
+              <w:right w:val="single" w:color="F79646" w:themeColor="accent6" w:sz="4"/>
+            </w:tcBorders>
+            <w:tcMar/>
+          </w:tcPr>
+          <w:p>
+            <w:pPr>
+              <w:spacing w:before="0" w:beforeAutospacing="off" w:after="0" w:afterAutospacing="off"/>
+            </w:pPr>
+            <w:r>
+              <w:rPr/>
+              <w:t>O sistema deve utilizar apenas tecnologias lecionadas na UC.</w:t>
+            </w:r>
+          </w:p>
+        </w:tc>
+      </w:tr>
+    </w:tbl>
+    <w:p>
+      <w:pPr>
+        <w:pStyle w:val="Normal"/>
+        <w:suppressLineNumbers w:val="0"/>
+        <w:bidi w:val="0"/>
+        <w:spacing w:before="0" w:beforeAutospacing="off" w:after="200" w:afterAutospacing="off" w:line="276" w:lineRule="auto"/>
+        <w:ind w:left="0" w:right="0"/>
+        <w:jc w:val="left"/>
+        <w:rPr>
+          <w:noProof w:val="0"/>
           <w:lang w:val="pt-BR"/>
         </w:rPr>
       </w:pPr>
@@ -15616,7 +18909,7 @@
     <w:name w:val="Hyperlink"/>
     <w:basedOn w:val="DefaultParagraphFont"/>
     <w:unhideWhenUsed/>
-    <w:rsid w:val="6EC364DC"/>
+    <w:rsid w:val="32AAE68A"/>
     <w:rPr>
       <w:color w:val="0000FF"/>
       <w:u w:val="single"/>
@@ -15628,7 +18921,7 @@
     <w:basedOn w:val="Normal"/>
     <w:next w:val="Normal"/>
     <w:unhideWhenUsed/>
-    <w:rsid w:val="6EC364DC"/>
+    <w:rsid w:val="32AAE68A"/>
     <w:pPr>
       <w:spacing w:after="100"/>
     </w:pPr>
@@ -15639,7 +18932,7 @@
     <w:basedOn w:val="Normal"/>
     <w:next w:val="Normal"/>
     <w:unhideWhenUsed/>
-    <w:rsid w:val="6EC364DC"/>
+    <w:rsid w:val="32AAE68A"/>
     <w:pPr>
       <w:spacing w:after="100"/>
       <w:ind w:left="220"/>

</xml_diff>